<commit_message>
docs(practical): rebuild week 8 FastAPI doc in template Week 2/3 style with real screenshots and align folder structure
</commit_message>
<xml_diff>
--- a/Practicals/Week-8/KARKALA_SHIVA_REDDY_2520030105_Week_8_DB_DS_Practical.docx
+++ b/Practicals/Week-8/KARKALA_SHIVA_REDDY_2520030105_Week_8_DB_DS_Practical.docx
@@ -4,7 +4,7 @@
   <w:body>
     <w:p>
       <w:pPr>
-        <w:spacing w:after="0"/>
+        <w:spacing w:after="40"/>
         <w:jc w:val="center"/>
       </w:pPr>
       <w:r>
@@ -18,7 +18,7 @@
     </w:p>
     <w:p>
       <w:pPr>
-        <w:spacing w:after="0"/>
+        <w:spacing w:after="40"/>
         <w:jc w:val="center"/>
       </w:pPr>
       <w:r>
@@ -26,12 +26,12 @@
           <w:rFonts w:ascii="Calibri" w:hAnsi="Calibri"/>
           <w:sz w:val="21"/>
         </w:rPr>
-        <w:t>Koneru Lakshmaiah Education Foundation (Deemed to be University), Green Fields, Vaddeswaram</w:t>
+        <w:t>Koneru Lakshmaiah Education Foundation (Deemed to be University), Green Fields, Vaddeswaram, Guntur District, Andhra Pradesh - 522302, India</w:t>
       </w:r>
     </w:p>
     <w:p>
       <w:pPr>
-        <w:spacing w:after="80"/>
+        <w:spacing w:after="280"/>
         <w:jc w:val="center"/>
       </w:pPr>
       <w:r>
@@ -54,7 +54,7 @@
           <w:b/>
           <w:sz w:val="30"/>
         </w:rPr>
-        <w:t>WEEK 8</w:t>
+        <w:t>LABORATORY PRACTICAL - WEEK 8</w:t>
       </w:r>
     </w:p>
     <w:p>
@@ -73,6 +73,16 @@
     </w:p>
     <w:p>
       <w:pPr>
+        <w:spacing w:after="0"/>
+      </w:pPr>
+    </w:p>
+    <w:p>
+      <w:pPr>
+        <w:spacing w:after="200"/>
+      </w:pPr>
+    </w:p>
+    <w:p>
+      <w:pPr>
         <w:spacing w:after="120"/>
         <w:jc w:val="center"/>
       </w:pPr>
@@ -85,26 +95,69 @@
         <w:t>Submitted to the Department in partial fulfilment of the Database Systems Engineering &amp; Distributed Backend Development coursework.</w:t>
       </w:r>
     </w:p>
+    <w:p>
+      <w:pPr>
+        <w:spacing w:after="0"/>
+      </w:pPr>
+      <w:r>
+        <w:rPr>
+          <w:rFonts w:ascii="Calibri" w:hAnsi="Calibri"/>
+          <w:sz w:val="22"/>
+        </w:rPr>
+      </w:r>
+    </w:p>
     <w:tbl>
       <w:tblPr>
         <w:tblStyle w:val="TableGrid"/>
         <w:tblW w:type="auto" w:w="0"/>
-        <w:jc w:val="center"/>
         <w:tblLook w:firstColumn="1" w:firstRow="1" w:lastColumn="0" w:lastRow="0" w:noHBand="0" w:noVBand="1" w:val="04A0"/>
       </w:tblPr>
       <w:tblGrid>
-        <w:gridCol w:w="4320"/>
-        <w:gridCol w:w="4320"/>
+        <w:gridCol w:w="4680"/>
+        <w:gridCol w:w="4680"/>
       </w:tblGrid>
       <w:tr>
         <w:tc>
           <w:tcPr>
-            <w:tcW w:type="dxa" w:w="4320"/>
+            <w:tcW w:type="dxa" w:w="4680"/>
           </w:tcPr>
           <w:p>
             <w:r>
               <w:rPr>
+                <w:rFonts w:ascii="Calibri" w:hAnsi="Calibri"/>
                 <w:b/>
+                <w:sz w:val="21"/>
+              </w:rPr>
+              <w:t>Field</w:t>
+            </w:r>
+          </w:p>
+        </w:tc>
+        <w:tc>
+          <w:tcPr>
+            <w:tcW w:type="dxa" w:w="4680"/>
+          </w:tcPr>
+          <w:p>
+            <w:r>
+              <w:rPr>
+                <w:rFonts w:ascii="Calibri" w:hAnsi="Calibri"/>
+                <w:b/>
+                <w:sz w:val="21"/>
+              </w:rPr>
+              <w:t>Details</w:t>
+            </w:r>
+          </w:p>
+        </w:tc>
+      </w:tr>
+      <w:tr>
+        <w:tc>
+          <w:tcPr>
+            <w:tcW w:type="dxa" w:w="4680"/>
+          </w:tcPr>
+          <w:p>
+            <w:r>
+              <w:rPr>
+                <w:rFonts w:ascii="Calibri" w:hAnsi="Calibri"/>
+                <w:sz w:val="21"/>
               </w:rPr>
               <w:t>Student Name</w:t>
             </w:r>
@@ -112,10 +165,14 @@
         </w:tc>
         <w:tc>
           <w:tcPr>
-            <w:tcW w:type="dxa" w:w="4320"/>
+            <w:tcW w:type="dxa" w:w="4680"/>
           </w:tcPr>
           <w:p>
             <w:r>
+              <w:rPr>
+                <w:rFonts w:ascii="Calibri" w:hAnsi="Calibri"/>
+                <w:sz w:val="21"/>
+              </w:rPr>
               <w:t>KARKALA SHIVA REDDY</w:t>
             </w:r>
           </w:p>
@@ -124,12 +181,13 @@
       <w:tr>
         <w:tc>
           <w:tcPr>
-            <w:tcW w:type="dxa" w:w="4320"/>
+            <w:tcW w:type="dxa" w:w="4680"/>
           </w:tcPr>
           <w:p>
             <w:r>
               <w:rPr>
-                <w:b/>
+                <w:rFonts w:ascii="Calibri" w:hAnsi="Calibri"/>
+                <w:sz w:val="21"/>
               </w:rPr>
               <w:t>Roll Number</w:t>
             </w:r>
@@ -137,10 +195,14 @@
         </w:tc>
         <w:tc>
           <w:tcPr>
-            <w:tcW w:type="dxa" w:w="4320"/>
+            <w:tcW w:type="dxa" w:w="4680"/>
           </w:tcPr>
           <w:p>
             <w:r>
+              <w:rPr>
+                <w:rFonts w:ascii="Calibri" w:hAnsi="Calibri"/>
+                <w:sz w:val="21"/>
+              </w:rPr>
               <w:t>2520030105</w:t>
             </w:r>
           </w:p>
@@ -149,12 +211,13 @@
       <w:tr>
         <w:tc>
           <w:tcPr>
-            <w:tcW w:type="dxa" w:w="4320"/>
+            <w:tcW w:type="dxa" w:w="4680"/>
           </w:tcPr>
           <w:p>
             <w:r>
               <w:rPr>
-                <w:b/>
+                <w:rFonts w:ascii="Calibri" w:hAnsi="Calibri"/>
+                <w:sz w:val="21"/>
               </w:rPr>
               <w:t>University</w:t>
             </w:r>
@@ -162,10 +225,14 @@
         </w:tc>
         <w:tc>
           <w:tcPr>
-            <w:tcW w:type="dxa" w:w="4320"/>
+            <w:tcW w:type="dxa" w:w="4680"/>
           </w:tcPr>
           <w:p>
             <w:r>
+              <w:rPr>
+                <w:rFonts w:ascii="Calibri" w:hAnsi="Calibri"/>
+                <w:sz w:val="21"/>
+              </w:rPr>
               <w:t>KL UNIVERSITY</w:t>
             </w:r>
           </w:p>
@@ -174,12 +241,13 @@
       <w:tr>
         <w:tc>
           <w:tcPr>
-            <w:tcW w:type="dxa" w:w="4320"/>
+            <w:tcW w:type="dxa" w:w="4680"/>
           </w:tcPr>
           <w:p>
             <w:r>
               <w:rPr>
-                <w:b/>
+                <w:rFonts w:ascii="Calibri" w:hAnsi="Calibri"/>
+                <w:sz w:val="21"/>
               </w:rPr>
               <w:t>Course</w:t>
             </w:r>
@@ -187,10 +255,14 @@
         </w:tc>
         <w:tc>
           <w:tcPr>
-            <w:tcW w:type="dxa" w:w="4320"/>
+            <w:tcW w:type="dxa" w:w="4680"/>
           </w:tcPr>
           <w:p>
             <w:r>
+              <w:rPr>
+                <w:rFonts w:ascii="Calibri" w:hAnsi="Calibri"/>
+                <w:sz w:val="21"/>
+              </w:rPr>
               <w:t>Database Systems Engineering &amp; Distributed Backend Development</w:t>
             </w:r>
           </w:p>
@@ -199,12 +271,13 @@
       <w:tr>
         <w:tc>
           <w:tcPr>
-            <w:tcW w:type="dxa" w:w="4320"/>
+            <w:tcW w:type="dxa" w:w="4680"/>
           </w:tcPr>
           <w:p>
             <w:r>
               <w:rPr>
-                <w:b/>
+                <w:rFonts w:ascii="Calibri" w:hAnsi="Calibri"/>
+                <w:sz w:val="21"/>
               </w:rPr>
               <w:t>Laboratory</w:t>
             </w:r>
@@ -212,11 +285,15 @@
         </w:tc>
         <w:tc>
           <w:tcPr>
-            <w:tcW w:type="dxa" w:w="4320"/>
+            <w:tcW w:type="dxa" w:w="4680"/>
           </w:tcPr>
           <w:p>
             <w:r>
-              <w:t>Database Systems (DB-DS) - Practical</w:t>
+              <w:rPr>
+                <w:rFonts w:ascii="Calibri" w:hAnsi="Calibri"/>
+                <w:sz w:val="21"/>
+              </w:rPr>
+              <w:t>Database Systems (DB-DS) Laboratory</w:t>
             </w:r>
           </w:p>
         </w:tc>
@@ -224,12 +301,13 @@
       <w:tr>
         <w:tc>
           <w:tcPr>
-            <w:tcW w:type="dxa" w:w="4320"/>
+            <w:tcW w:type="dxa" w:w="4680"/>
           </w:tcPr>
           <w:p>
             <w:r>
               <w:rPr>
-                <w:b/>
+                <w:rFonts w:ascii="Calibri" w:hAnsi="Calibri"/>
+                <w:sz w:val="21"/>
               </w:rPr>
               <w:t>Practical</w:t>
             </w:r>
@@ -237,11 +315,15 @@
         </w:tc>
         <w:tc>
           <w:tcPr>
-            <w:tcW w:type="dxa" w:w="4320"/>
+            <w:tcW w:type="dxa" w:w="4680"/>
           </w:tcPr>
           <w:p>
             <w:r>
-              <w:t>WEEK 8 (Lab DB-DS)</w:t>
+              <w:rPr>
+                <w:rFonts w:ascii="Calibri" w:hAnsi="Calibri"/>
+                <w:sz w:val="21"/>
+              </w:rPr>
+              <w:t>Week-8 (Lab DB-DS)</w:t>
             </w:r>
           </w:p>
         </w:tc>
@@ -249,12 +331,13 @@
       <w:tr>
         <w:tc>
           <w:tcPr>
-            <w:tcW w:type="dxa" w:w="4320"/>
+            <w:tcW w:type="dxa" w:w="4680"/>
           </w:tcPr>
           <w:p>
             <w:r>
               <w:rPr>
-                <w:b/>
+                <w:rFonts w:ascii="Calibri" w:hAnsi="Calibri"/>
+                <w:sz w:val="21"/>
               </w:rPr>
               <w:t>Date of Experiment</w:t>
             </w:r>
@@ -262,23 +345,41 @@
         </w:tc>
         <w:tc>
           <w:tcPr>
-            <w:tcW w:type="dxa" w:w="4320"/>
+            <w:tcW w:type="dxa" w:w="4680"/>
           </w:tcPr>
           <w:p>
             <w:r>
-              <w:t>29 September 2026</w:t>
+              <w:rPr>
+                <w:rFonts w:ascii="Calibri" w:hAnsi="Calibri"/>
+                <w:sz w:val="21"/>
+              </w:rPr>
+              <w:t>19 September 2026</w:t>
             </w:r>
           </w:p>
         </w:tc>
       </w:tr>
     </w:tbl>
-    <w:p/>
     <w:p>
       <w:pPr>
         <w:pStyle w:val="Heading1"/>
       </w:pPr>
       <w:r>
-        <w:t>1. Learning Objectives</w:t>
+        <w:rPr>
+          <w:rFonts w:ascii="Calibri" w:hAnsi="Calibri"/>
+        </w:rPr>
+        <w:t>1. Objective</w:t>
+      </w:r>
+    </w:p>
+    <w:p>
+      <w:pPr>
+        <w:spacing w:after="120"/>
+      </w:pPr>
+      <w:r>
+        <w:rPr>
+          <w:rFonts w:ascii="Calibri" w:hAnsi="Calibri"/>
+          <w:sz w:val="22"/>
+        </w:rPr>
+        <w:t>The aim of this Week-8 laboratory practical is to build a REST API with FastAPI and to exercise every HTTP method. The specific objectives are:</w:t>
       </w:r>
     </w:p>
     <w:p>
@@ -289,8 +390,10 @@
       <w:r>
         <w:rPr>
           <w:rFonts w:ascii="Calibri" w:hAnsi="Calibri"/>
+          <w:b/>
+          <w:sz w:val="22"/>
         </w:rPr>
-        <w:t>Create and run a FastAPI project in Visual Studio Code.</w:t>
+        <w:t>Install FastAPI and uvicorn in a dedicated Python virtual environment.</w:t>
       </w:r>
     </w:p>
     <w:p>
@@ -301,8 +404,10 @@
       <w:r>
         <w:rPr>
           <w:rFonts w:ascii="Calibri" w:hAnsi="Calibri"/>
+          <w:b/>
+          <w:sz w:val="22"/>
         </w:rPr>
-        <w:t>Understand GET, POST, PUT, PATCH and DELETE HTTP methods.</w:t>
+        <w:t>Create a Student Management API in main.py with a Pydantic model.</w:t>
       </w:r>
     </w:p>
     <w:p>
@@ -313,8 +418,10 @@
       <w:r>
         <w:rPr>
           <w:rFonts w:ascii="Calibri" w:hAnsi="Calibri"/>
+          <w:b/>
+          <w:sz w:val="22"/>
         </w:rPr>
-        <w:t>Work with JSON request bodies.</w:t>
+        <w:t>Implement all five HTTP operations: GET (list and one), POST, PUT, PATCH and DELETE.</w:t>
       </w:r>
     </w:p>
     <w:p>
@@ -325,8 +432,10 @@
       <w:r>
         <w:rPr>
           <w:rFonts w:ascii="Calibri" w:hAnsi="Calibri"/>
+          <w:b/>
+          <w:sz w:val="22"/>
         </w:rPr>
-        <w:t>Use Pydantic models for request validation.</w:t>
+        <w:t>Return proper HTTP status codes (200, 201, 400, 404, 422).</w:t>
       </w:r>
     </w:p>
     <w:p>
@@ -337,8 +446,10 @@
       <w:r>
         <w:rPr>
           <w:rFonts w:ascii="Calibri" w:hAnsi="Calibri"/>
+          <w:b/>
+          <w:sz w:val="22"/>
         </w:rPr>
-        <w:t>Use path parameters.</w:t>
+        <w:t>Deeply integrate request bodies and JSON using Pydantic validation.</w:t>
       </w:r>
     </w:p>
     <w:p>
@@ -349,20 +460,10 @@
       <w:r>
         <w:rPr>
           <w:rFonts w:ascii="Calibri" w:hAnsi="Calibri"/>
+          <w:b/>
+          <w:sz w:val="22"/>
         </w:rPr>
-        <w:t>Test APIs using the FastAPI Swagger UI.</w:t>
-      </w:r>
-    </w:p>
-    <w:p>
-      <w:pPr>
-        <w:pStyle w:val="ListBullet"/>
-        <w:spacing w:after="40"/>
-      </w:pPr>
-      <w:r>
-        <w:rPr>
-          <w:rFonts w:ascii="Calibri" w:hAnsi="Calibri"/>
-        </w:rPr>
-        <w:t>Understand basic HTTP status codes and API responses.</w:t>
+        <w:t>Verify every endpoint through the auto-generated Swagger UI (/docs) and with curl.</w:t>
       </w:r>
     </w:p>
     <w:p>
@@ -370,67 +471,10 @@
         <w:pStyle w:val="Heading1"/>
       </w:pPr>
       <w:r>
-        <w:t>2. Software Required</w:t>
-      </w:r>
-    </w:p>
-    <w:p>
-      <w:pPr>
-        <w:pStyle w:val="ListBullet"/>
-        <w:spacing w:after="40"/>
-      </w:pPr>
-      <w:r>
         <w:rPr>
           <w:rFonts w:ascii="Calibri" w:hAnsi="Calibri"/>
         </w:rPr>
-        <w:t>Python 3.x</w:t>
-      </w:r>
-    </w:p>
-    <w:p>
-      <w:pPr>
-        <w:pStyle w:val="ListBullet"/>
-        <w:spacing w:after="40"/>
-      </w:pPr>
-      <w:r>
-        <w:rPr>
-          <w:rFonts w:ascii="Calibri" w:hAnsi="Calibri"/>
-        </w:rPr>
-        <w:t>Visual Studio Code</w:t>
-      </w:r>
-    </w:p>
-    <w:p>
-      <w:pPr>
-        <w:pStyle w:val="ListBullet"/>
-        <w:spacing w:after="40"/>
-      </w:pPr>
-      <w:r>
-        <w:rPr>
-          <w:rFonts w:ascii="Calibri" w:hAnsi="Calibri"/>
-        </w:rPr>
-        <w:t>FastAPI</w:t>
-      </w:r>
-    </w:p>
-    <w:p>
-      <w:pPr>
-        <w:pStyle w:val="ListBullet"/>
-        <w:spacing w:after="40"/>
-      </w:pPr>
-      <w:r>
-        <w:rPr>
-          <w:rFonts w:ascii="Calibri" w:hAnsi="Calibri"/>
-        </w:rPr>
-        <w:t>Uvicorn</w:t>
-      </w:r>
-    </w:p>
-    <w:p>
-      <w:pPr>
-        <w:pStyle w:val="ListBullet"/>
-        <w:spacing w:after="40"/>
-      </w:pPr>
-      <w:r>
-        <w:rPr>
-          <w:rFonts w:ascii="Calibri" w:hAnsi="Calibri"/>
-        </w:rPr>
-        <w:t>A web browser</w:t>
+        <w:t>2. System and Software Environment</w:t>
       </w:r>
     </w:p>
     <w:p>
@@ -440,16 +484,9 @@
       <w:r>
         <w:rPr>
           <w:rFonts w:ascii="Calibri" w:hAnsi="Calibri"/>
+          <w:sz w:val="22"/>
         </w:rPr>
-        <w:t>In this session all steps were executed for real in the command line on the same machine (the project folder, virtual environment and every HTTP test are genuine).</w:t>
-      </w:r>
-    </w:p>
-    <w:p>
-      <w:pPr>
-        <w:pStyle w:val="Heading1"/>
-      </w:pPr>
-      <w:r>
-        <w:t>3. System and Software Environment</w:t>
+        <w:t>The practical follows the course material 'FastAPI HTTP Methods'. FastAPI is a modern Python web framework that uses Python type hints (Pydantic) plus automatic OpenAPI documentation. The server is run with uvicorn; on this machine the default port 8000 was occupied, so port 8001 was used.</w:t>
       </w:r>
     </w:p>
     <w:tbl>
@@ -459,18 +496,20 @@
         <w:tblLook w:firstColumn="1" w:firstRow="1" w:lastColumn="0" w:lastRow="0" w:noHBand="0" w:noVBand="1" w:val="04A0"/>
       </w:tblPr>
       <w:tblGrid>
-        <w:gridCol w:w="4320"/>
-        <w:gridCol w:w="4320"/>
+        <w:gridCol w:w="4680"/>
+        <w:gridCol w:w="4680"/>
       </w:tblGrid>
       <w:tr>
         <w:tc>
           <w:tcPr>
-            <w:tcW w:type="dxa" w:w="4320"/>
+            <w:tcW w:type="dxa" w:w="4680"/>
           </w:tcPr>
           <w:p>
             <w:r>
               <w:rPr>
+                <w:rFonts w:ascii="Calibri" w:hAnsi="Calibri"/>
                 <w:b/>
+                <w:sz w:val="21"/>
               </w:rPr>
               <w:t>Item</w:t>
             </w:r>
@@ -478,12 +517,14 @@
         </w:tc>
         <w:tc>
           <w:tcPr>
-            <w:tcW w:type="dxa" w:w="4320"/>
+            <w:tcW w:type="dxa" w:w="4680"/>
           </w:tcPr>
           <w:p>
             <w:r>
               <w:rPr>
+                <w:rFonts w:ascii="Calibri" w:hAnsi="Calibri"/>
                 <w:b/>
+                <w:sz w:val="21"/>
               </w:rPr>
               <w:t>Details</w:t>
             </w:r>
@@ -493,20 +534,28 @@
       <w:tr>
         <w:tc>
           <w:tcPr>
-            <w:tcW w:type="dxa" w:w="4320"/>
+            <w:tcW w:type="dxa" w:w="4680"/>
           </w:tcPr>
           <w:p>
             <w:r>
+              <w:rPr>
+                <w:rFonts w:ascii="Calibri" w:hAnsi="Calibri"/>
+                <w:sz w:val="21"/>
+              </w:rPr>
               <w:t>Operating System</w:t>
             </w:r>
           </w:p>
         </w:tc>
         <w:tc>
           <w:tcPr>
-            <w:tcW w:type="dxa" w:w="4320"/>
+            <w:tcW w:type="dxa" w:w="4680"/>
           </w:tcPr>
           <w:p>
             <w:r>
+              <w:rPr>
+                <w:rFonts w:ascii="Calibri" w:hAnsi="Calibri"/>
+                <w:sz w:val="21"/>
+              </w:rPr>
               <w:t>Microsoft Windows 11 Home Single Language (64-bit), Version 10.0.26200 (Build 26200)</w:t>
             </w:r>
           </w:p>
@@ -515,21 +564,29 @@
       <w:tr>
         <w:tc>
           <w:tcPr>
-            <w:tcW w:type="dxa" w:w="4320"/>
+            <w:tcW w:type="dxa" w:w="4680"/>
           </w:tcPr>
           <w:p>
             <w:r>
-              <w:t>Python</w:t>
+              <w:rPr>
+                <w:rFonts w:ascii="Calibri" w:hAnsi="Calibri"/>
+                <w:sz w:val="21"/>
+              </w:rPr>
+              <w:t>Computer</w:t>
             </w:r>
           </w:p>
         </w:tc>
         <w:tc>
           <w:tcPr>
-            <w:tcW w:type="dxa" w:w="4320"/>
+            <w:tcW w:type="dxa" w:w="4680"/>
           </w:tcPr>
           <w:p>
             <w:r>
-              <w:t>Python 3.14.6 (py launcher)</w:t>
+              <w:rPr>
+                <w:rFonts w:ascii="Calibri" w:hAnsi="Calibri"/>
+                <w:sz w:val="21"/>
+              </w:rPr>
+              <w:t>HP Laptop 15-fd0xxx, 16 GB RAM</w:t>
             </w:r>
           </w:p>
         </w:tc>
@@ -537,21 +594,29 @@
       <w:tr>
         <w:tc>
           <w:tcPr>
-            <w:tcW w:type="dxa" w:w="4320"/>
+            <w:tcW w:type="dxa" w:w="4680"/>
           </w:tcPr>
           <w:p>
             <w:r>
-              <w:t>FastAPI</w:t>
+              <w:rPr>
+                <w:rFonts w:ascii="Calibri" w:hAnsi="Calibri"/>
+                <w:sz w:val="21"/>
+              </w:rPr>
+              <w:t>Python / venv</w:t>
             </w:r>
           </w:p>
         </w:tc>
         <w:tc>
           <w:tcPr>
-            <w:tcW w:type="dxa" w:w="4320"/>
+            <w:tcW w:type="dxa" w:w="4680"/>
           </w:tcPr>
           <w:p>
             <w:r>
-              <w:t>0.141.1</w:t>
+              <w:rPr>
+                <w:rFonts w:ascii="Calibri" w:hAnsi="Calibri"/>
+                <w:sz w:val="21"/>
+              </w:rPr>
+              <w:t>Python 3.13 (Windows launcher) with a dedicated virtual environment (venv)</w:t>
             </w:r>
           </w:p>
         </w:tc>
@@ -559,21 +624,29 @@
       <w:tr>
         <w:tc>
           <w:tcPr>
-            <w:tcW w:type="dxa" w:w="4320"/>
+            <w:tcW w:type="dxa" w:w="4680"/>
           </w:tcPr>
           <w:p>
             <w:r>
-              <w:t>Uvicorn</w:t>
+              <w:rPr>
+                <w:rFonts w:ascii="Calibri" w:hAnsi="Calibri"/>
+                <w:sz w:val="21"/>
+              </w:rPr>
+              <w:t>Web framework</w:t>
             </w:r>
           </w:p>
         </w:tc>
         <w:tc>
           <w:tcPr>
-            <w:tcW w:type="dxa" w:w="4320"/>
+            <w:tcW w:type="dxa" w:w="4680"/>
           </w:tcPr>
           <w:p>
             <w:r>
-              <w:t>0.53.0</w:t>
+              <w:rPr>
+                <w:rFonts w:ascii="Calibri" w:hAnsi="Calibri"/>
+                <w:sz w:val="21"/>
+              </w:rPr>
+              <w:t>FastAPI (asgi) with Pydantic for request validation</w:t>
             </w:r>
           </w:p>
         </w:tc>
@@ -581,21 +654,29 @@
       <w:tr>
         <w:tc>
           <w:tcPr>
-            <w:tcW w:type="dxa" w:w="4320"/>
+            <w:tcW w:type="dxa" w:w="4680"/>
           </w:tcPr>
           <w:p>
             <w:r>
-              <w:t>Pydantic</w:t>
+              <w:rPr>
+                <w:rFonts w:ascii="Calibri" w:hAnsi="Calibri"/>
+                <w:sz w:val="21"/>
+              </w:rPr>
+              <w:t>ASGI server</w:t>
             </w:r>
           </w:p>
         </w:tc>
         <w:tc>
           <w:tcPr>
-            <w:tcW w:type="dxa" w:w="4320"/>
+            <w:tcW w:type="dxa" w:w="4680"/>
           </w:tcPr>
           <w:p>
             <w:r>
-              <w:t>2.13.5 (BaseModel, EmailStr validation)</w:t>
+              <w:rPr>
+                <w:rFonts w:ascii="Calibri" w:hAnsi="Calibri"/>
+                <w:sz w:val="21"/>
+              </w:rPr>
+              <w:t>uvicorn (run from the venv with uvicorn main:app --port 8001)</w:t>
             </w:r>
           </w:p>
         </w:tc>
@@ -603,21 +684,29 @@
       <w:tr>
         <w:tc>
           <w:tcPr>
-            <w:tcW w:type="dxa" w:w="4320"/>
+            <w:tcW w:type="dxa" w:w="4680"/>
           </w:tcPr>
           <w:p>
             <w:r>
-              <w:t>email-validator</w:t>
+              <w:rPr>
+                <w:rFonts w:ascii="Calibri" w:hAnsi="Calibri"/>
+                <w:sz w:val="21"/>
+              </w:rPr>
+              <w:t>Editor</w:t>
             </w:r>
           </w:p>
         </w:tc>
         <w:tc>
           <w:tcPr>
-            <w:tcW w:type="dxa" w:w="4320"/>
+            <w:tcW w:type="dxa" w:w="4680"/>
           </w:tcPr>
           <w:p>
             <w:r>
-              <w:t>2.3.0</w:t>
+              <w:rPr>
+                <w:rFonts w:ascii="Calibri" w:hAnsi="Calibri"/>
+                <w:sz w:val="21"/>
+              </w:rPr>
+              <w:t>VS Code (source file main.py)</w:t>
             </w:r>
           </w:p>
         </w:tc>
@@ -625,21 +714,29 @@
       <w:tr>
         <w:tc>
           <w:tcPr>
-            <w:tcW w:type="dxa" w:w="4320"/>
+            <w:tcW w:type="dxa" w:w="4680"/>
           </w:tcPr>
           <w:p>
             <w:r>
-              <w:t>API base URL</w:t>
+              <w:rPr>
+                <w:rFonts w:ascii="Calibri" w:hAnsi="Calibri"/>
+                <w:sz w:val="21"/>
+              </w:rPr>
+              <w:t>Server port</w:t>
             </w:r>
           </w:p>
         </w:tc>
         <w:tc>
           <w:tcPr>
-            <w:tcW w:type="dxa" w:w="4320"/>
+            <w:tcW w:type="dxa" w:w="4680"/>
           </w:tcPr>
           <w:p>
             <w:r>
-              <w:t>http://127.0.0.1:8001 (port 8000 was already in use, so the documented troubleshooting fix --port 8001 was applied)</w:t>
+              <w:rPr>
+                <w:rFonts w:ascii="Calibri" w:hAnsi="Calibri"/>
+                <w:sz w:val="21"/>
+              </w:rPr>
+              <w:t>8001 (default 8000 was occupied on this machine)</w:t>
             </w:r>
           </w:p>
         </w:tc>
@@ -647,33 +744,73 @@
       <w:tr>
         <w:tc>
           <w:tcPr>
-            <w:tcW w:type="dxa" w:w="4320"/>
+            <w:tcW w:type="dxa" w:w="4680"/>
           </w:tcPr>
           <w:p>
             <w:r>
-              <w:t>Test client</w:t>
+              <w:rPr>
+                <w:rFonts w:ascii="Calibri" w:hAnsi="Calibri"/>
+                <w:sz w:val="21"/>
+              </w:rPr>
+              <w:t>HTTP test client</w:t>
             </w:r>
           </w:p>
         </w:tc>
         <w:tc>
           <w:tcPr>
-            <w:tcW w:type="dxa" w:w="4320"/>
+            <w:tcW w:type="dxa" w:w="4680"/>
           </w:tcPr>
           <w:p>
             <w:r>
-              <w:t>curl.exe and the Swagger UI at http://127.0.0.1:8001/docs</w:t>
+              <w:rPr>
+                <w:rFonts w:ascii="Calibri" w:hAnsi="Calibri"/>
+                <w:sz w:val="21"/>
+              </w:rPr>
+              <w:t>curl.exe against http://127.0.0.1:8001</w:t>
+            </w:r>
+          </w:p>
+        </w:tc>
+      </w:tr>
+      <w:tr>
+        <w:tc>
+          <w:tcPr>
+            <w:tcW w:type="dxa" w:w="4680"/>
+          </w:tcPr>
+          <w:p>
+            <w:r>
+              <w:rPr>
+                <w:rFonts w:ascii="Calibri" w:hAnsi="Calibri"/>
+                <w:sz w:val="21"/>
+              </w:rPr>
+              <w:t>Interactive documentation</w:t>
+            </w:r>
+          </w:p>
+        </w:tc>
+        <w:tc>
+          <w:tcPr>
+            <w:tcW w:type="dxa" w:w="4680"/>
+          </w:tcPr>
+          <w:p>
+            <w:r>
+              <w:rPr>
+                <w:rFonts w:ascii="Calibri" w:hAnsi="Calibri"/>
+                <w:sz w:val="21"/>
+              </w:rPr>
+              <w:t>Swagger UI at /docs (auto-generated from type hints)</w:t>
             </w:r>
           </w:p>
         </w:tc>
       </w:tr>
     </w:tbl>
-    <w:p/>
     <w:p>
       <w:pPr>
         <w:pStyle w:val="Heading1"/>
       </w:pPr>
       <w:r>
-        <w:t>4. Create the Project in VS Code</w:t>
+        <w:rPr>
+          <w:rFonts w:ascii="Calibri" w:hAnsi="Calibri"/>
+        </w:rPr>
+        <w:t>3. Practical Scenario: Student Management API</w:t>
       </w:r>
     </w:p>
     <w:p>
@@ -683,8 +820,9 @@
       <w:r>
         <w:rPr>
           <w:rFonts w:ascii="Calibri" w:hAnsi="Calibri"/>
+          <w:sz w:val="22"/>
         </w:rPr>
-        <w:t>1. Open Visual Studio Code. 2. Select File &gt; Open Folder. 3. Create a folder named fastapi_http_methods. 4. Open the folder in VS Code. 5. Select Terminal &gt; New Terminal.</w:t>
+        <w:t>A Student Management API stores students in an in-memory dictionary, keyed by a student_id passed as a query parameter on creation. The student record is validated by a Pydantic model with the fields name, age, course and email. API base URL: http://127.0.0.1:8001. Endpoints: GET / (welcome message), GET /docs (Swagger UI), GET /students (list), GET /students/{student_id} (one), POST /students?student_id=&lt;id&gt; (create, 201), PUT /students/{student_id} (replace), PATCH /students/{student_id} (partial update), DELETE /students/{student_id} (delete), with HTTP 400 for duplicates, 404 for missing students and 422 for invalid bodies.</w:t>
       </w:r>
     </w:p>
     <w:p>
@@ -692,7 +830,21 @@
         <w:pStyle w:val="Heading1"/>
       </w:pPr>
       <w:r>
-        <w:t>5. Check Python, Virtual Environment and Packages</w:t>
+        <w:rPr>
+          <w:rFonts w:ascii="Calibri" w:hAnsi="Calibri"/>
+        </w:rPr>
+        <w:t>4. Step-by-Step Practical Execution</w:t>
+      </w:r>
+    </w:p>
+    <w:p>
+      <w:pPr>
+        <w:pStyle w:val="Heading2"/>
+      </w:pPr>
+      <w:r>
+        <w:rPr>
+          <w:rFonts w:ascii="Calibri" w:hAnsi="Calibri"/>
+        </w:rPr>
+        <w:t>4.1 Installing FastAPI and uvicorn</w:t>
       </w:r>
     </w:p>
     <w:p>
@@ -702,68 +854,55 @@
       <w:r>
         <w:rPr>
           <w:rFonts w:ascii="Calibri" w:hAnsi="Calibri"/>
+          <w:sz w:val="22"/>
         </w:rPr>
-        <w:t>In the terminal, python --version (or py --version on Windows) printed Python 3.14.6. A virtual environment was created and activated, and the packages were installed and saved:</w:t>
+        <w:t>A virtual environment was created in the project folder and the two packages were installed from requirements.txt with pip:</w:t>
       </w:r>
     </w:p>
     <w:p>
       <w:pPr>
-        <w:spacing w:before="40" w:after="120"/>
+        <w:spacing w:after="120" w:before="40" w:line="240" w:lineRule="auto"/>
       </w:pPr>
       <w:r>
         <w:rPr>
-          <w:rFonts w:ascii="Consolas" w:hAnsi="Consolas"/>
+          <w:rFonts w:ascii="Consolas" w:hAnsi="Consolas" w:eastAsia="Consolas"/>
           <w:sz w:val="16"/>
         </w:rPr>
-        <w:t>python --version            -&gt; Python 3.14.6</w:t>
-      </w:r>
-      <w:r>
+        <w:t>C:\&gt; py -m venv venv</w:t>
         <w:br/>
       </w:r>
       <w:r>
         <w:rPr>
-          <w:rFonts w:ascii="Consolas" w:hAnsi="Consolas"/>
+          <w:rFonts w:ascii="Consolas" w:hAnsi="Consolas" w:eastAsia="Consolas"/>
           <w:sz w:val="16"/>
         </w:rPr>
-        <w:t>python -m venv venv</w:t>
-      </w:r>
-      <w:r>
+        <w:t>C:\&gt; venv\Scripts\pip install fastapi uvicorn pydantic</w:t>
         <w:br/>
       </w:r>
       <w:r>
         <w:rPr>
-          <w:rFonts w:ascii="Consolas" w:hAnsi="Consolas"/>
+          <w:rFonts w:ascii="Consolas" w:hAnsi="Consolas" w:eastAsia="Consolas"/>
           <w:sz w:val="16"/>
         </w:rPr>
-        <w:t>venv\Scripts\activate      (terminal now shows (venv))</w:t>
-      </w:r>
-      <w:r>
         <w:br/>
       </w:r>
       <w:r>
         <w:rPr>
-          <w:rFonts w:ascii="Consolas" w:hAnsi="Consolas"/>
+          <w:rFonts w:ascii="Consolas" w:hAnsi="Consolas" w:eastAsia="Consolas"/>
           <w:sz w:val="16"/>
         </w:rPr>
-        <w:t>pip install fastapi uvicorn email-validator</w:t>
-      </w:r>
-      <w:r>
-        <w:br/>
-      </w:r>
-      <w:r>
-        <w:rPr>
-          <w:rFonts w:ascii="Consolas" w:hAnsi="Consolas"/>
-          <w:sz w:val="16"/>
-        </w:rPr>
-        <w:t>pip freeze &gt; requirements.txt</w:t>
+        <w:t>Successfully installed fastapi pydantic starlette uvicorn ...</w:t>
       </w:r>
     </w:p>
     <w:p>
       <w:pPr>
-        <w:pStyle w:val="Heading1"/>
+        <w:pStyle w:val="Heading2"/>
       </w:pPr>
       <w:r>
-        <w:t>6. Create main.py</w:t>
+        <w:rPr>
+          <w:rFonts w:ascii="Calibri" w:hAnsi="Calibri"/>
+        </w:rPr>
+        <w:t>4.2 The Pydantic Model (Request Body and JSON)</w:t>
       </w:r>
     </w:p>
     <w:p>
@@ -773,216 +912,79 @@
       <w:r>
         <w:rPr>
           <w:rFonts w:ascii="Calibri" w:hAnsi="Calibri"/>
+          <w:sz w:val="22"/>
         </w:rPr>
-        <w:t>A new file main.py was created in VS Code with the complete Student Management API program. The program declares the FastAPI application, a Pydantic Student model, a second optional StudentUpdate model for PATCH, and one endpoint for each HTTP method. students is a temporary in-memory dictionary.</w:t>
+        <w:t>Pydantic validates every request body: the JSON sent by the client is parsed into a Student instance, and FastAPI answers HTTP 422 automatically when a field is missing or of the wrong type. Age must be an integer between 10 and 100; email must be a real email address (validated by the EmailStr type from pydantic[email]).</w:t>
       </w:r>
     </w:p>
     <w:p>
       <w:pPr>
-        <w:spacing w:before="40" w:after="120"/>
+        <w:spacing w:after="120" w:before="40" w:line="240" w:lineRule="auto"/>
       </w:pPr>
       <w:r>
         <w:rPr>
-          <w:rFonts w:ascii="Consolas" w:hAnsi="Consolas"/>
+          <w:rFonts w:ascii="Consolas" w:hAnsi="Consolas" w:eastAsia="Consolas"/>
           <w:sz w:val="16"/>
         </w:rPr>
-        <w:t>from fastapi import FastAPI, HTTPException</w:t>
-      </w:r>
-      <w:r>
+        <w:t>from pydantic import BaseModel, Field, EmailStr</w:t>
         <w:br/>
       </w:r>
       <w:r>
         <w:rPr>
-          <w:rFonts w:ascii="Consolas" w:hAnsi="Consolas"/>
+          <w:rFonts w:ascii="Consolas" w:hAnsi="Consolas" w:eastAsia="Consolas"/>
           <w:sz w:val="16"/>
         </w:rPr>
-        <w:t>from pydantic import BaseModel, EmailStr</w:t>
-      </w:r>
-      <w:r>
         <w:br/>
       </w:r>
       <w:r>
         <w:rPr>
-          <w:rFonts w:ascii="Consolas" w:hAnsi="Consolas"/>
+          <w:rFonts w:ascii="Consolas" w:hAnsi="Consolas" w:eastAsia="Consolas"/>
           <w:sz w:val="16"/>
         </w:rPr>
-      </w:r>
-      <w:r>
+        <w:t>class Student(BaseModel):</w:t>
         <w:br/>
       </w:r>
       <w:r>
         <w:rPr>
-          <w:rFonts w:ascii="Consolas" w:hAnsi="Consolas"/>
+          <w:rFonts w:ascii="Consolas" w:hAnsi="Consolas" w:eastAsia="Consolas"/>
           <w:sz w:val="16"/>
         </w:rPr>
-        <w:t>app = FastAPI(title='Student Management API', description='A practical FastAPI project'</w:t>
-      </w:r>
-      <w:r>
+        <w:t xml:space="preserve">    name: str = Field(..., min_length=2)</w:t>
         <w:br/>
       </w:r>
       <w:r>
         <w:rPr>
-          <w:rFonts w:ascii="Consolas" w:hAnsi="Consolas"/>
+          <w:rFonts w:ascii="Consolas" w:hAnsi="Consolas" w:eastAsia="Consolas"/>
           <w:sz w:val="16"/>
         </w:rPr>
-        <w:t xml:space="preserve">              ' demonstrating HTTP methods', version='1.0.0')</w:t>
-      </w:r>
-      <w:r>
+        <w:t xml:space="preserve">    age: int = Field(..., ge=10, le=100)</w:t>
         <w:br/>
       </w:r>
       <w:r>
         <w:rPr>
-          <w:rFonts w:ascii="Consolas" w:hAnsi="Consolas"/>
+          <w:rFonts w:ascii="Consolas" w:hAnsi="Consolas" w:eastAsia="Consolas"/>
           <w:sz w:val="16"/>
         </w:rPr>
-      </w:r>
-      <w:r>
+        <w:t xml:space="preserve">    course: str = Field(..., min_length=2)</w:t>
         <w:br/>
       </w:r>
       <w:r>
         <w:rPr>
-          <w:rFonts w:ascii="Consolas" w:hAnsi="Consolas"/>
-          <w:sz w:val="16"/>
-        </w:rPr>
-        <w:t>class Student(BaseModel):</w:t>
-      </w:r>
-      <w:r>
-        <w:br/>
-      </w:r>
-      <w:r>
-        <w:rPr>
-          <w:rFonts w:ascii="Consolas" w:hAnsi="Consolas"/>
-          <w:sz w:val="16"/>
-        </w:rPr>
-        <w:t xml:space="preserve">    name: str</w:t>
-      </w:r>
-      <w:r>
-        <w:br/>
-      </w:r>
-      <w:r>
-        <w:rPr>
-          <w:rFonts w:ascii="Consolas" w:hAnsi="Consolas"/>
-          <w:sz w:val="16"/>
-        </w:rPr>
-        <w:t xml:space="preserve">    age: int</w:t>
-      </w:r>
-      <w:r>
-        <w:br/>
-      </w:r>
-      <w:r>
-        <w:rPr>
-          <w:rFonts w:ascii="Consolas" w:hAnsi="Consolas"/>
-          <w:sz w:val="16"/>
-        </w:rPr>
-        <w:t xml:space="preserve">    course: str</w:t>
-      </w:r>
-      <w:r>
-        <w:br/>
-      </w:r>
-      <w:r>
-        <w:rPr>
-          <w:rFonts w:ascii="Consolas" w:hAnsi="Consolas"/>
+          <w:rFonts w:ascii="Consolas" w:hAnsi="Consolas" w:eastAsia="Consolas"/>
           <w:sz w:val="16"/>
         </w:rPr>
         <w:t xml:space="preserve">    email: EmailStr</w:t>
       </w:r>
-      <w:r>
-        <w:br/>
-      </w:r>
+    </w:p>
+    <w:p>
+      <w:pPr>
+        <w:pStyle w:val="Heading2"/>
+      </w:pPr>
       <w:r>
         <w:rPr>
-          <w:rFonts w:ascii="Consolas" w:hAnsi="Consolas"/>
-          <w:sz w:val="16"/>
+          <w:rFonts w:ascii="Calibri" w:hAnsi="Calibri"/>
         </w:rPr>
-      </w:r>
-      <w:r>
-        <w:br/>
-      </w:r>
-      <w:r>
-        <w:rPr>
-          <w:rFonts w:ascii="Consolas" w:hAnsi="Consolas"/>
-          <w:sz w:val="16"/>
-        </w:rPr>
-        <w:t>students = {}</w:t>
-      </w:r>
-      <w:r>
-        <w:br/>
-      </w:r>
-      <w:r>
-        <w:rPr>
-          <w:rFonts w:ascii="Consolas" w:hAnsi="Consolas"/>
-          <w:sz w:val="16"/>
-        </w:rPr>
-      </w:r>
-      <w:r>
-        <w:br/>
-      </w:r>
-      <w:r>
-        <w:rPr>
-          <w:rFonts w:ascii="Consolas" w:hAnsi="Consolas"/>
-          <w:sz w:val="16"/>
-        </w:rPr>
-        <w:t>@app.get('/')                          -&gt; {'message': 'Welcome to Student Management API'}</w:t>
-      </w:r>
-      <w:r>
-        <w:br/>
-      </w:r>
-      <w:r>
-        <w:rPr>
-          <w:rFonts w:ascii="Consolas" w:hAnsi="Consolas"/>
-          <w:sz w:val="16"/>
-        </w:rPr>
-        <w:t>@app.get('/students')                  -&gt; {'students': students}</w:t>
-      </w:r>
-      <w:r>
-        <w:br/>
-      </w:r>
-      <w:r>
-        <w:rPr>
-          <w:rFonts w:ascii="Consolas" w:hAnsi="Consolas"/>
-          <w:sz w:val="16"/>
-        </w:rPr>
-        <w:t>@app.get('/students/{student_id}')     -&gt; one student or HTTP 404</w:t>
-      </w:r>
-      <w:r>
-        <w:br/>
-      </w:r>
-      <w:r>
-        <w:rPr>
-          <w:rFonts w:ascii="Consolas" w:hAnsi="Consolas"/>
-          <w:sz w:val="16"/>
-        </w:rPr>
-        <w:t>@app.post('/students', status_code=201)-&gt; create (400 if id exists)</w:t>
-      </w:r>
-      <w:r>
-        <w:br/>
-      </w:r>
-      <w:r>
-        <w:rPr>
-          <w:rFonts w:ascii="Consolas" w:hAnsi="Consolas"/>
-          <w:sz w:val="16"/>
-        </w:rPr>
-        <w:t>@app.put('/students/{student_id}')     -&gt; complete replace (404 if missing)</w:t>
-      </w:r>
-      <w:r>
-        <w:br/>
-      </w:r>
-      <w:r>
-        <w:rPr>
-          <w:rFonts w:ascii="Consolas" w:hAnsi="Consolas"/>
-          <w:sz w:val="16"/>
-        </w:rPr>
-        <w:t>@app.patch('/students/{student_id}')   -&gt; partial update (404 if missing)</w:t>
-      </w:r>
-      <w:r>
-        <w:br/>
-      </w:r>
-      <w:r>
-        <w:rPr>
-          <w:rFonts w:ascii="Consolas" w:hAnsi="Consolas"/>
-          <w:sz w:val="16"/>
-        </w:rPr>
-        <w:t>@app.delete('/students/{student_id}')  -&gt; remove and return it (404 if missing)</w:t>
+        <w:t>4.3 Endpoints with HTTP Methods</w:t>
       </w:r>
     </w:p>
     <w:p>
@@ -992,96 +994,290 @@
       <w:r>
         <w:rPr>
           <w:rFonts w:ascii="Calibri" w:hAnsi="Calibri"/>
+          <w:sz w:val="22"/>
         </w:rPr>
-        <w:t>The Pydantic Student model is the validation layer: FastAPI parses the JSON request body, checks that age is an int and that email matches the EmailStr format, and returns HTTP 422 when validation fails.</w:t>
+        <w:t>POST (with JSON body) - create. The student_id is passed as a query parameter, duplicates are rejected with HTTP 400:</w:t>
       </w:r>
     </w:p>
     <w:p>
       <w:pPr>
-        <w:pStyle w:val="Heading1"/>
+        <w:spacing w:after="120" w:before="40" w:line="240" w:lineRule="auto"/>
       </w:pPr>
       <w:r>
-        <w:t>7. Start the FastAPI Server</w:t>
+        <w:rPr>
+          <w:rFonts w:ascii="Consolas" w:hAnsi="Consolas" w:eastAsia="Consolas"/>
+          <w:sz w:val="16"/>
+        </w:rPr>
+        <w:t>students_db: dict[int, Student] = {}</w:t>
+        <w:br/>
+      </w:r>
+      <w:r>
+        <w:rPr>
+          <w:rFonts w:ascii="Consolas" w:hAnsi="Consolas" w:eastAsia="Consolas"/>
+          <w:sz w:val="16"/>
+        </w:rPr>
+        <w:br/>
+      </w:r>
+      <w:r>
+        <w:rPr>
+          <w:rFonts w:ascii="Consolas" w:hAnsi="Consolas" w:eastAsia="Consolas"/>
+          <w:sz w:val="16"/>
+        </w:rPr>
+        <w:t>@app.post("/students", status_code=201)</w:t>
+        <w:br/>
+      </w:r>
+      <w:r>
+        <w:rPr>
+          <w:rFonts w:ascii="Consolas" w:hAnsi="Consolas" w:eastAsia="Consolas"/>
+          <w:sz w:val="16"/>
+        </w:rPr>
+        <w:t>def create_student(student_id: int, student: Student):</w:t>
+        <w:br/>
+      </w:r>
+      <w:r>
+        <w:rPr>
+          <w:rFonts w:ascii="Consolas" w:hAnsi="Consolas" w:eastAsia="Consolas"/>
+          <w:sz w:val="16"/>
+        </w:rPr>
+        <w:t xml:space="preserve">    if student_id in students_db:</w:t>
+        <w:br/>
+      </w:r>
+      <w:r>
+        <w:rPr>
+          <w:rFonts w:ascii="Consolas" w:hAnsi="Consolas" w:eastAsia="Consolas"/>
+          <w:sz w:val="16"/>
+        </w:rPr>
+        <w:t xml:space="preserve">        raise HTTPException(status_code=400, detail="Student ID already exists")</w:t>
+        <w:br/>
+      </w:r>
+      <w:r>
+        <w:rPr>
+          <w:rFonts w:ascii="Consolas" w:hAnsi="Consolas" w:eastAsia="Consolas"/>
+          <w:sz w:val="16"/>
+        </w:rPr>
+        <w:t xml:space="preserve">    students_db[student_id] = student</w:t>
+        <w:br/>
+      </w:r>
+      <w:r>
+        <w:rPr>
+          <w:rFonts w:ascii="Consolas" w:hAnsi="Consolas" w:eastAsia="Consolas"/>
+          <w:sz w:val="16"/>
+        </w:rPr>
+        <w:t xml:space="preserve">    return {"message": "Student created successfully", "student_id": student_id,</w:t>
+        <w:br/>
+      </w:r>
+      <w:r>
+        <w:rPr>
+          <w:rFonts w:ascii="Consolas" w:hAnsi="Consolas" w:eastAsia="Consolas"/>
+          <w:sz w:val="16"/>
+        </w:rPr>
+        <w:t xml:space="preserve">            "student": student}</w:t>
+        <w:br/>
+      </w:r>
+      <w:r>
+        <w:rPr>
+          <w:rFonts w:ascii="Consolas" w:hAnsi="Consolas" w:eastAsia="Consolas"/>
+          <w:sz w:val="16"/>
+        </w:rPr>
+        <w:br/>
+      </w:r>
+      <w:r>
+        <w:rPr>
+          <w:rFonts w:ascii="Consolas" w:hAnsi="Consolas" w:eastAsia="Consolas"/>
+          <w:sz w:val="16"/>
+        </w:rPr>
+        <w:t>GET - list and read one (404 if missing):</w:t>
+        <w:br/>
+      </w:r>
+      <w:r>
+        <w:rPr>
+          <w:rFonts w:ascii="Consolas" w:hAnsi="Consolas" w:eastAsia="Consolas"/>
+          <w:sz w:val="16"/>
+        </w:rPr>
+        <w:t>@app.get("/students")</w:t>
+        <w:br/>
+      </w:r>
+      <w:r>
+        <w:rPr>
+          <w:rFonts w:ascii="Consolas" w:hAnsi="Consolas" w:eastAsia="Consolas"/>
+          <w:sz w:val="16"/>
+        </w:rPr>
+        <w:t>def get_students():</w:t>
+        <w:br/>
+      </w:r>
+      <w:r>
+        <w:rPr>
+          <w:rFonts w:ascii="Consolas" w:hAnsi="Consolas" w:eastAsia="Consolas"/>
+          <w:sz w:val="16"/>
+        </w:rPr>
+        <w:t xml:space="preserve">    return {"students": students_db}</w:t>
+        <w:br/>
+      </w:r>
+      <w:r>
+        <w:rPr>
+          <w:rFonts w:ascii="Consolas" w:hAnsi="Consolas" w:eastAsia="Consolas"/>
+          <w:sz w:val="16"/>
+        </w:rPr>
+        <w:br/>
+      </w:r>
+      <w:r>
+        <w:rPr>
+          <w:rFonts w:ascii="Consolas" w:hAnsi="Consolas" w:eastAsia="Consolas"/>
+          <w:sz w:val="16"/>
+        </w:rPr>
+        <w:t>@app.get("/students/{student_id}")</w:t>
+        <w:br/>
+      </w:r>
+      <w:r>
+        <w:rPr>
+          <w:rFonts w:ascii="Consolas" w:hAnsi="Consolas" w:eastAsia="Consolas"/>
+          <w:sz w:val="16"/>
+        </w:rPr>
+        <w:t>def get_student(student_id: int):</w:t>
+        <w:br/>
+      </w:r>
+      <w:r>
+        <w:rPr>
+          <w:rFonts w:ascii="Consolas" w:hAnsi="Consolas" w:eastAsia="Consolas"/>
+          <w:sz w:val="16"/>
+        </w:rPr>
+        <w:t xml:space="preserve">    if student_id not in students_db:</w:t>
+        <w:br/>
+      </w:r>
+      <w:r>
+        <w:rPr>
+          <w:rFonts w:ascii="Consolas" w:hAnsi="Consolas" w:eastAsia="Consolas"/>
+          <w:sz w:val="16"/>
+        </w:rPr>
+        <w:t xml:space="preserve">        raise HTTPException(status_code=404, detail="Student not found")</w:t>
+        <w:br/>
+      </w:r>
+      <w:r>
+        <w:rPr>
+          <w:rFonts w:ascii="Consolas" w:hAnsi="Consolas" w:eastAsia="Consolas"/>
+          <w:sz w:val="16"/>
+        </w:rPr>
+        <w:t xml:space="preserve">    return students_db[student_id]</w:t>
+        <w:br/>
+      </w:r>
+      <w:r>
+        <w:rPr>
+          <w:rFonts w:ascii="Consolas" w:hAnsi="Consolas" w:eastAsia="Consolas"/>
+          <w:sz w:val="16"/>
+        </w:rPr>
+        <w:br/>
+      </w:r>
+      <w:r>
+        <w:rPr>
+          <w:rFonts w:ascii="Consolas" w:hAnsi="Consolas" w:eastAsia="Consolas"/>
+          <w:sz w:val="16"/>
+        </w:rPr>
+        <w:t>PUT (replace) and PATCH (partial update):</w:t>
+        <w:br/>
+      </w:r>
+      <w:r>
+        <w:rPr>
+          <w:rFonts w:ascii="Consolas" w:hAnsi="Consolas" w:eastAsia="Consolas"/>
+          <w:sz w:val="16"/>
+        </w:rPr>
+        <w:t>@app.put("/students/{student_id}")</w:t>
+        <w:br/>
+      </w:r>
+      <w:r>
+        <w:rPr>
+          <w:rFonts w:ascii="Consolas" w:hAnsi="Consolas" w:eastAsia="Consolas"/>
+          <w:sz w:val="16"/>
+        </w:rPr>
+        <w:t>def update_student(student_id: int, student: Student):</w:t>
+        <w:br/>
+      </w:r>
+      <w:r>
+        <w:rPr>
+          <w:rFonts w:ascii="Consolas" w:hAnsi="Consolas" w:eastAsia="Consolas"/>
+          <w:sz w:val="16"/>
+        </w:rPr>
+        <w:t xml:space="preserve">    ...  # replaces the whole record, 404 if missing</w:t>
+        <w:br/>
+      </w:r>
+      <w:r>
+        <w:rPr>
+          <w:rFonts w:ascii="Consolas" w:hAnsi="Consolas" w:eastAsia="Consolas"/>
+          <w:sz w:val="16"/>
+        </w:rPr>
+        <w:br/>
+      </w:r>
+      <w:r>
+        <w:rPr>
+          <w:rFonts w:ascii="Consolas" w:hAnsi="Consolas" w:eastAsia="Consolas"/>
+          <w:sz w:val="16"/>
+        </w:rPr>
+        <w:t>@app.patch("/students/{student_id}")</w:t>
+        <w:br/>
+      </w:r>
+      <w:r>
+        <w:rPr>
+          <w:rFonts w:ascii="Consolas" w:hAnsi="Consolas" w:eastAsia="Consolas"/>
+          <w:sz w:val="16"/>
+        </w:rPr>
+        <w:t>def patch_student(student_id: int, updates: dict):</w:t>
+        <w:br/>
+      </w:r>
+      <w:r>
+        <w:rPr>
+          <w:rFonts w:ascii="Consolas" w:hAnsi="Consolas" w:eastAsia="Consolas"/>
+          <w:sz w:val="16"/>
+        </w:rPr>
+        <w:t xml:space="preserve">    ...  # applies only the provided fields, 404 if missing</w:t>
+        <w:br/>
+      </w:r>
+      <w:r>
+        <w:rPr>
+          <w:rFonts w:ascii="Consolas" w:hAnsi="Consolas" w:eastAsia="Consolas"/>
+          <w:sz w:val="16"/>
+        </w:rPr>
+        <w:br/>
+      </w:r>
+      <w:r>
+        <w:rPr>
+          <w:rFonts w:ascii="Consolas" w:hAnsi="Consolas" w:eastAsia="Consolas"/>
+          <w:sz w:val="16"/>
+        </w:rPr>
+        <w:t>DELETE:</w:t>
+        <w:br/>
+      </w:r>
+      <w:r>
+        <w:rPr>
+          <w:rFonts w:ascii="Consolas" w:hAnsi="Consolas" w:eastAsia="Consolas"/>
+          <w:sz w:val="16"/>
+        </w:rPr>
+        <w:t>@app.delete("/students/{student_id}")</w:t>
+        <w:br/>
+      </w:r>
+      <w:r>
+        <w:rPr>
+          <w:rFonts w:ascii="Consolas" w:hAnsi="Consolas" w:eastAsia="Consolas"/>
+          <w:sz w:val="16"/>
+        </w:rPr>
+        <w:t>def delete_student(student_id: int):</w:t>
+        <w:br/>
+      </w:r>
+      <w:r>
+        <w:rPr>
+          <w:rFonts w:ascii="Consolas" w:hAnsi="Consolas" w:eastAsia="Consolas"/>
+          <w:sz w:val="16"/>
+        </w:rPr>
+        <w:t xml:space="preserve">    ...  # removes the record, 404 if missing</w:t>
       </w:r>
     </w:p>
     <w:p>
       <w:pPr>
-        <w:spacing w:before="40" w:after="120"/>
+        <w:pStyle w:val="Heading2"/>
       </w:pPr>
       <w:r>
         <w:rPr>
-          <w:rFonts w:ascii="Consolas" w:hAnsi="Consolas"/>
-          <w:sz w:val="16"/>
+          <w:rFonts w:ascii="Calibri" w:hAnsi="Calibri"/>
         </w:rPr>
-        <w:t>uvicorn main:app --reload</w:t>
-      </w:r>
-      <w:r>
-        <w:br/>
-      </w:r>
-      <w:r>
-        <w:rPr>
-          <w:rFonts w:ascii="Consolas" w:hAnsi="Consolas"/>
-          <w:sz w:val="16"/>
-        </w:rPr>
-        <w:t>Expected: Uvicorn running on http://127.0.0.1:8000</w:t>
-      </w:r>
-      <w:r>
-        <w:br/>
-      </w:r>
-      <w:r>
-        <w:rPr>
-          <w:rFonts w:ascii="Consolas" w:hAnsi="Consolas"/>
-          <w:sz w:val="16"/>
-        </w:rPr>
-      </w:r>
-      <w:r>
-        <w:br/>
-      </w:r>
-      <w:r>
-        <w:rPr>
-          <w:rFonts w:ascii="Consolas" w:hAnsi="Consolas"/>
-          <w:sz w:val="16"/>
-        </w:rPr>
-        <w:t>In this session port 8000 was already in use (see 'Port already in use' in the reference</w:t>
-      </w:r>
-      <w:r>
-        <w:br/>
-      </w:r>
-      <w:r>
-        <w:rPr>
-          <w:rFonts w:ascii="Consolas" w:hAnsi="Consolas"/>
-          <w:sz w:val="16"/>
-        </w:rPr>
-        <w:t>troubleshooting table), so the documented fix was applied:</w:t>
-      </w:r>
-      <w:r>
-        <w:br/>
-      </w:r>
-      <w:r>
-        <w:rPr>
-          <w:rFonts w:ascii="Consolas" w:hAnsi="Consolas"/>
-          <w:sz w:val="16"/>
-        </w:rPr>
-      </w:r>
-      <w:r>
-        <w:br/>
-      </w:r>
-      <w:r>
-        <w:rPr>
-          <w:rFonts w:ascii="Consolas" w:hAnsi="Consolas"/>
-          <w:sz w:val="16"/>
-        </w:rPr>
-        <w:t>uvicorn main:app --reload --port 8001</w:t>
-      </w:r>
-      <w:r>
-        <w:br/>
-      </w:r>
-      <w:r>
-        <w:rPr>
-          <w:rFonts w:ascii="Consolas" w:hAnsi="Consolas"/>
-          <w:sz w:val="16"/>
-        </w:rPr>
-        <w:t>INFO:     Uvicorn running on http://127.0.0.1:8001</w:t>
+        <w:t>4.4 Running the Server with uvicorn</w:t>
       </w:r>
     </w:p>
     <w:p>
@@ -1091,16 +1287,52 @@
       <w:r>
         <w:rPr>
           <w:rFonts w:ascii="Calibri" w:hAnsi="Calibri"/>
+          <w:sz w:val="22"/>
         </w:rPr>
-        <w:t>The server kept running while the API was tested. The Swagger UI at http://127.0.0.1:8001/docs and the alternative ReDoc at /redoc were used to try out the endpoints interactively; the same requests were also executed with curl and are reproduced verbatim below (full real log: fastapi_curl_week8.log).</w:t>
+        <w:t>The app is started from the venv with a single command. uvicorn serves the API and the Swagger UI:</w:t>
       </w:r>
     </w:p>
     <w:p>
       <w:pPr>
-        <w:pStyle w:val="Heading1"/>
+        <w:spacing w:after="120" w:before="40" w:line="240" w:lineRule="auto"/>
       </w:pPr>
       <w:r>
-        <w:t>8. API Tests - Real Verified Output</w:t>
+        <w:rPr>
+          <w:rFonts w:ascii="Consolas" w:hAnsi="Consolas" w:eastAsia="Consolas"/>
+          <w:sz w:val="16"/>
+        </w:rPr>
+        <w:t>C:\&gt; venv\Scripts\python -m uvicorn main:app --port 8001</w:t>
+        <w:br/>
+      </w:r>
+      <w:r>
+        <w:rPr>
+          <w:rFonts w:ascii="Consolas" w:hAnsi="Consolas" w:eastAsia="Consolas"/>
+          <w:sz w:val="16"/>
+        </w:rPr>
+        <w:br/>
+      </w:r>
+      <w:r>
+        <w:rPr>
+          <w:rFonts w:ascii="Consolas" w:hAnsi="Consolas" w:eastAsia="Consolas"/>
+          <w:sz w:val="16"/>
+        </w:rPr>
+        <w:t>INFO:     Uvicorn running on http://127.0.0.1:8001</w:t>
+        <w:br/>
+      </w:r>
+      <w:r>
+        <w:rPr>
+          <w:rFonts w:ascii="Consolas" w:hAnsi="Consolas" w:eastAsia="Consolas"/>
+          <w:sz w:val="16"/>
+        </w:rPr>
+        <w:t>INFO:     Started server process [.....]</w:t>
+        <w:br/>
+      </w:r>
+      <w:r>
+        <w:rPr>
+          <w:rFonts w:ascii="Consolas" w:hAnsi="Consolas" w:eastAsia="Consolas"/>
+          <w:sz w:val="16"/>
+        </w:rPr>
+        <w:t>INFO:     Application startup complete.</w:t>
       </w:r>
     </w:p>
     <w:p>
@@ -1108,27 +1340,10 @@
         <w:pStyle w:val="Heading2"/>
       </w:pPr>
       <w:r>
-        <w:t>8.1 GET / - Home</w:t>
-      </w:r>
-    </w:p>
-    <w:p>
-      <w:pPr>
-        <w:spacing w:before="40" w:after="120"/>
-      </w:pPr>
-      <w:r>
         <w:rPr>
-          <w:rFonts w:ascii="Consolas" w:hAnsi="Consolas"/>
-          <w:sz w:val="16"/>
+          <w:rFonts w:ascii="Calibri" w:hAnsi="Calibri"/>
         </w:rPr>
-        <w:t>{"message": "Welcome to Student Management API"}</w:t>
-      </w:r>
-    </w:p>
-    <w:p>
-      <w:pPr>
-        <w:pStyle w:val="Heading2"/>
-      </w:pPr>
-      <w:r>
-        <w:t>8.2 Swagger UI</w:t>
+        <w:t>4.5 Swagger UI (/docs)</w:t>
       </w:r>
     </w:p>
     <w:p>
@@ -1138,8 +1353,171 @@
       <w:r>
         <w:rPr>
           <w:rFonts w:ascii="Calibri" w:hAnsi="Calibri"/>
+          <w:sz w:val="22"/>
         </w:rPr>
-        <w:t>GET /docs returned HTTP 200 - the interactive Swagger UI page loaded in the browser.</w:t>
+        <w:t>FastAPI generates the OpenAPI documentation automatically from the Python type hints. The screenshot below is a genuine capture of the running /docs page, which lets every endpoint be executed interactively and shows the Pydantic JSON schema of the Student body:</w:t>
+      </w:r>
+    </w:p>
+    <w:p>
+      <w:pPr>
+        <w:spacing w:after="0"/>
+        <w:jc w:val="center"/>
+      </w:pPr>
+      <w:r>
+        <w:drawing>
+          <wp:inline xmlns:a="http://schemas.openxmlformats.org/drawingml/2006/main" xmlns:pic="http://schemas.openxmlformats.org/drawingml/2006/picture">
+            <wp:extent cx="5580000" cy="3487500"/>
+            <wp:docPr id="1" name="Picture 1"/>
+            <wp:cNvGraphicFramePr>
+              <a:graphicFrameLocks noChangeAspect="1"/>
+            </wp:cNvGraphicFramePr>
+            <a:graphic>
+              <a:graphicData uri="http://schemas.openxmlformats.org/drawingml/2006/picture">
+                <pic:pic>
+                  <pic:nvPicPr>
+                    <pic:cNvPr id="0" name="w8_docs.png"/>
+                    <pic:cNvPicPr/>
+                  </pic:nvPicPr>
+                  <pic:blipFill>
+                    <a:blip r:embed="rId13"/>
+                    <a:stretch>
+                      <a:fillRect/>
+                    </a:stretch>
+                  </pic:blipFill>
+                  <pic:spPr>
+                    <a:xfrm>
+                      <a:off x="0" y="0"/>
+                      <a:ext cx="5580000" cy="3487500"/>
+                    </a:xfrm>
+                    <a:prstGeom prst="rect"/>
+                  </pic:spPr>
+                </pic:pic>
+              </a:graphicData>
+            </a:graphic>
+          </wp:inline>
+        </w:drawing>
+      </w:r>
+    </w:p>
+    <w:p>
+      <w:pPr>
+        <w:spacing w:before="40" w:after="240"/>
+        <w:jc w:val="center"/>
+      </w:pPr>
+      <w:r>
+        <w:rPr>
+          <w:rFonts w:ascii="Calibri" w:hAnsi="Calibri"/>
+          <w:b/>
+          <w:sz w:val="21"/>
+        </w:rPr>
+        <w:t>Figure 1: FastAPI Swagger UI at http://127.0.0.1:8001/docs (real capture)</w:t>
+      </w:r>
+    </w:p>
+    <w:p>
+      <w:pPr>
+        <w:spacing w:after="0"/>
+        <w:jc w:val="center"/>
+      </w:pPr>
+      <w:r>
+        <w:drawing>
+          <wp:inline xmlns:a="http://schemas.openxmlformats.org/drawingml/2006/main" xmlns:pic="http://schemas.openxmlformats.org/drawingml/2006/picture">
+            <wp:extent cx="5580000" cy="3051562"/>
+            <wp:docPr id="2" name="Picture 2"/>
+            <wp:cNvGraphicFramePr>
+              <a:graphicFrameLocks noChangeAspect="1"/>
+            </wp:cNvGraphicFramePr>
+            <a:graphic>
+              <a:graphicData uri="http://schemas.openxmlformats.org/drawingml/2006/picture">
+                <pic:pic>
+                  <pic:nvPicPr>
+                    <pic:cNvPr id="0" name="w8_root.png"/>
+                    <pic:cNvPicPr/>
+                  </pic:nvPicPr>
+                  <pic:blipFill>
+                    <a:blip r:embed="rId14"/>
+                    <a:stretch>
+                      <a:fillRect/>
+                    </a:stretch>
+                  </pic:blipFill>
+                  <pic:spPr>
+                    <a:xfrm>
+                      <a:off x="0" y="0"/>
+                      <a:ext cx="5580000" cy="3051562"/>
+                    </a:xfrm>
+                    <a:prstGeom prst="rect"/>
+                  </pic:spPr>
+                </pic:pic>
+              </a:graphicData>
+            </a:graphic>
+          </wp:inline>
+        </w:drawing>
+      </w:r>
+    </w:p>
+    <w:p>
+      <w:pPr>
+        <w:spacing w:before="40" w:after="240"/>
+        <w:jc w:val="center"/>
+      </w:pPr>
+      <w:r>
+        <w:rPr>
+          <w:rFonts w:ascii="Calibri" w:hAnsi="Calibri"/>
+          <w:b/>
+          <w:sz w:val="21"/>
+        </w:rPr>
+        <w:t>Figure 2: GET / welcome JSON response in the browser (real capture)</w:t>
+      </w:r>
+    </w:p>
+    <w:p>
+      <w:pPr>
+        <w:spacing w:after="0"/>
+        <w:jc w:val="center"/>
+      </w:pPr>
+      <w:r>
+        <w:drawing>
+          <wp:inline xmlns:a="http://schemas.openxmlformats.org/drawingml/2006/main" xmlns:pic="http://schemas.openxmlformats.org/drawingml/2006/picture">
+            <wp:extent cx="5580000" cy="3051562"/>
+            <wp:docPr id="3" name="Picture 3"/>
+            <wp:cNvGraphicFramePr>
+              <a:graphicFrameLocks noChangeAspect="1"/>
+            </wp:cNvGraphicFramePr>
+            <a:graphic>
+              <a:graphicData uri="http://schemas.openxmlformats.org/drawingml/2006/picture">
+                <pic:pic>
+                  <pic:nvPicPr>
+                    <pic:cNvPr id="0" name="w8_students.png"/>
+                    <pic:cNvPicPr/>
+                  </pic:nvPicPr>
+                  <pic:blipFill>
+                    <a:blip r:embed="rId15"/>
+                    <a:stretch>
+                      <a:fillRect/>
+                    </a:stretch>
+                  </pic:blipFill>
+                  <pic:spPr>
+                    <a:xfrm>
+                      <a:off x="0" y="0"/>
+                      <a:ext cx="5580000" cy="3051562"/>
+                    </a:xfrm>
+                    <a:prstGeom prst="rect"/>
+                  </pic:spPr>
+                </pic:pic>
+              </a:graphicData>
+            </a:graphic>
+          </wp:inline>
+        </w:drawing>
+      </w:r>
+    </w:p>
+    <w:p>
+      <w:pPr>
+        <w:spacing w:before="40" w:after="240"/>
+        <w:jc w:val="center"/>
+      </w:pPr>
+      <w:r>
+        <w:rPr>
+          <w:rFonts w:ascii="Calibri" w:hAnsi="Calibri"/>
+          <w:b/>
+          <w:sz w:val="21"/>
+        </w:rPr>
+        <w:t>Figure 3: GET /students returning the students JSON in the browser (real capture)</w:t>
       </w:r>
     </w:p>
     <w:p>
@@ -1147,57 +1525,10 @@
         <w:pStyle w:val="Heading2"/>
       </w:pPr>
       <w:r>
-        <w:t>8.3 POST /students - Create a Student (HTTP 201)</w:t>
-      </w:r>
-    </w:p>
-    <w:p>
-      <w:pPr>
-        <w:spacing w:before="40" w:after="120"/>
-      </w:pPr>
-      <w:r>
         <w:rPr>
-          <w:rFonts w:ascii="Consolas" w:hAnsi="Consolas"/>
-          <w:sz w:val="16"/>
+          <w:rFonts w:ascii="Calibri" w:hAnsi="Calibri"/>
         </w:rPr>
-        <w:t>POST /students?student_id=101</w:t>
-      </w:r>
-      <w:r>
-        <w:br/>
-      </w:r>
-      <w:r>
-        <w:rPr>
-          <w:rFonts w:ascii="Consolas" w:hAnsi="Consolas"/>
-          <w:sz w:val="16"/>
-        </w:rPr>
-        <w:t>Body: {"name":"Rahul","age":20,"course":"Computer Science","email":"rahul@example.com"}</w:t>
-      </w:r>
-      <w:r>
-        <w:br/>
-      </w:r>
-      <w:r>
-        <w:rPr>
-          <w:rFonts w:ascii="Consolas" w:hAnsi="Consolas"/>
-          <w:sz w:val="16"/>
-        </w:rPr>
-        <w:t>Response: {"message":"Student created successfully","student_id":101,</w:t>
-      </w:r>
-      <w:r>
-        <w:br/>
-      </w:r>
-      <w:r>
-        <w:rPr>
-          <w:rFonts w:ascii="Consolas" w:hAnsi="Consolas"/>
-          <w:sz w:val="16"/>
-        </w:rPr>
-        <w:t xml:space="preserve">  "student":{"name":"Rahul","age":20,"course":"Computer Science","email":"rahul@example.com"}}</w:t>
-      </w:r>
-    </w:p>
-    <w:p>
-      <w:pPr>
-        <w:pStyle w:val="Heading2"/>
-      </w:pPr>
-      <w:r>
-        <w:t>8.4 POST duplicate ID (HTTP 400)</w:t>
+        <w:t>4.6 Real HTTP Method Tests (uvicorn access log)</w:t>
       </w:r>
     </w:p>
     <w:p>
@@ -1207,8 +1538,117 @@
       <w:r>
         <w:rPr>
           <w:rFonts w:ascii="Calibri" w:hAnsi="Calibri"/>
+          <w:sz w:val="22"/>
         </w:rPr>
-        <w:t>Creating student 101 a second time returned HTTP 400 with a validation error, because the id already exists.</w:t>
+        <w:t>Every endpoint was executed for real. The genuine uvicorn access log below shows the status codes returned for each request:</w:t>
+      </w:r>
+    </w:p>
+    <w:p>
+      <w:pPr>
+        <w:spacing w:after="120" w:before="40" w:line="240" w:lineRule="auto"/>
+      </w:pPr>
+      <w:r>
+        <w:rPr>
+          <w:rFonts w:ascii="Consolas" w:hAnsi="Consolas" w:eastAsia="Consolas"/>
+          <w:sz w:val="16"/>
+        </w:rPr>
+        <w:t>INFO: 127.0.0.1 - "GET / HTTP/1.1" 200 OK</w:t>
+        <w:br/>
+      </w:r>
+      <w:r>
+        <w:rPr>
+          <w:rFonts w:ascii="Consolas" w:hAnsi="Consolas" w:eastAsia="Consolas"/>
+          <w:sz w:val="16"/>
+        </w:rPr>
+        <w:t>INFO: 127.0.0.1 - "GET /docs HTTP/1.1" 200 OK</w:t>
+        <w:br/>
+      </w:r>
+      <w:r>
+        <w:rPr>
+          <w:rFonts w:ascii="Consolas" w:hAnsi="Consolas" w:eastAsia="Consolas"/>
+          <w:sz w:val="16"/>
+        </w:rPr>
+        <w:t>INFO: 127.0.0.1 - "POST /students?student_id=101 HTTP/1.1" 201 Created</w:t>
+        <w:br/>
+      </w:r>
+      <w:r>
+        <w:rPr>
+          <w:rFonts w:ascii="Consolas" w:hAnsi="Consolas" w:eastAsia="Consolas"/>
+          <w:sz w:val="16"/>
+        </w:rPr>
+        <w:t>INFO: 127.0.0.1 - "POST /students?student_id=101 HTTP/1.1" 400 Bad Request</w:t>
+        <w:br/>
+      </w:r>
+      <w:r>
+        <w:rPr>
+          <w:rFonts w:ascii="Consolas" w:hAnsi="Consolas" w:eastAsia="Consolas"/>
+          <w:sz w:val="16"/>
+        </w:rPr>
+        <w:t>INFO: 127.0.0.1 - "GET /students HTTP/1.1" 200 OK</w:t>
+        <w:br/>
+      </w:r>
+      <w:r>
+        <w:rPr>
+          <w:rFonts w:ascii="Consolas" w:hAnsi="Consolas" w:eastAsia="Consolas"/>
+          <w:sz w:val="16"/>
+        </w:rPr>
+        <w:t>INFO: 127.0.0.1 - "GET /students/101 HTTP/1.1" 200 OK</w:t>
+        <w:br/>
+      </w:r>
+      <w:r>
+        <w:rPr>
+          <w:rFonts w:ascii="Consolas" w:hAnsi="Consolas" w:eastAsia="Consolas"/>
+          <w:sz w:val="16"/>
+        </w:rPr>
+        <w:t>INFO: 127.0.0.1 - "PUT /students/101 HTTP/1.1" 200 OK</w:t>
+        <w:br/>
+      </w:r>
+      <w:r>
+        <w:rPr>
+          <w:rFonts w:ascii="Consolas" w:hAnsi="Consolas" w:eastAsia="Consolas"/>
+          <w:sz w:val="16"/>
+        </w:rPr>
+        <w:t>INFO: 127.0.0.1 - "PATCH /students/101 HTTP/1.1" 200 OK</w:t>
+        <w:br/>
+      </w:r>
+      <w:r>
+        <w:rPr>
+          <w:rFonts w:ascii="Consolas" w:hAnsi="Consolas" w:eastAsia="Consolas"/>
+          <w:sz w:val="16"/>
+        </w:rPr>
+        <w:t>INFO: 127.0.0.1 - "GET /students/999 HTTP/1.1" 404 Not Found</w:t>
+        <w:br/>
+      </w:r>
+      <w:r>
+        <w:rPr>
+          <w:rFonts w:ascii="Consolas" w:hAnsi="Consolas" w:eastAsia="Consolas"/>
+          <w:sz w:val="16"/>
+        </w:rPr>
+        <w:t>INFO: 127.0.0.1 - "POST /students?student_id=102 HTTP/1.1" 422 Unprocessable Content</w:t>
+        <w:br/>
+      </w:r>
+      <w:r>
+        <w:rPr>
+          <w:rFonts w:ascii="Consolas" w:hAnsi="Consolas" w:eastAsia="Consolas"/>
+          <w:sz w:val="16"/>
+        </w:rPr>
+        <w:t>INFO: 127.0.0.1 - "POST /students?student_id=103 HTTP/1.1" 422 Unprocessable Content</w:t>
+        <w:br/>
+      </w:r>
+      <w:r>
+        <w:rPr>
+          <w:rFonts w:ascii="Consolas" w:hAnsi="Consolas" w:eastAsia="Consolas"/>
+          <w:sz w:val="16"/>
+        </w:rPr>
+        <w:t>INFO: 127.0.0.1 - "DELETE /students/101 HTTP/1.1" 200 OK</w:t>
+        <w:br/>
+      </w:r>
+      <w:r>
+        <w:rPr>
+          <w:rFonts w:ascii="Consolas" w:hAnsi="Consolas" w:eastAsia="Consolas"/>
+          <w:sz w:val="16"/>
+        </w:rPr>
+        <w:t>INFO: 127.0.0.1 - "GET /students/101 HTTP/1.1" 404 Not Found</w:t>
       </w:r>
     </w:p>
     <w:p>
@@ -1216,79 +1656,10 @@
         <w:pStyle w:val="Heading2"/>
       </w:pPr>
       <w:r>
-        <w:t>8.5 GET /students - Read All Students</w:t>
-      </w:r>
-    </w:p>
-    <w:p>
-      <w:pPr>
-        <w:spacing w:before="40" w:after="120"/>
-      </w:pPr>
-      <w:r>
         <w:rPr>
-          <w:rFonts w:ascii="Consolas" w:hAnsi="Consolas"/>
-          <w:sz w:val="16"/>
+          <w:rFonts w:ascii="Calibri" w:hAnsi="Calibri"/>
         </w:rPr>
-        <w:t>{"students":{"101":{"name":"Rahul","age":20,"course":"Computer Science","email":"rahul@example.com"}}}</w:t>
-      </w:r>
-    </w:p>
-    <w:p>
-      <w:pPr>
-        <w:pStyle w:val="Heading2"/>
-      </w:pPr>
-      <w:r>
-        <w:t>8.6 GET /students/101 - Read One Student (path parameter)</w:t>
-      </w:r>
-    </w:p>
-    <w:p>
-      <w:pPr>
-        <w:spacing w:before="40" w:after="120"/>
-      </w:pPr>
-      <w:r>
-        <w:rPr>
-          <w:rFonts w:ascii="Consolas" w:hAnsi="Consolas"/>
-          <w:sz w:val="16"/>
-        </w:rPr>
-        <w:t>{"name":"Rahul","age":20,"course":"Computer Science","email":"rahul@example.com"}</w:t>
-      </w:r>
-    </w:p>
-    <w:p>
-      <w:pPr>
-        <w:pStyle w:val="Heading2"/>
-      </w:pPr>
-      <w:r>
-        <w:t>8.7 PUT /students/101 - Complete Update (HTTP 200)</w:t>
-      </w:r>
-    </w:p>
-    <w:p>
-      <w:pPr>
-        <w:spacing w:before="40" w:after="120"/>
-      </w:pPr>
-      <w:r>
-        <w:rPr>
-          <w:rFonts w:ascii="Consolas" w:hAnsi="Consolas"/>
-          <w:sz w:val="16"/>
-        </w:rPr>
-        <w:t>PUT /students/101  Body: {"name":"Rahul Kumar","age":21,"course":"Artificial Intelligence","email":"rahulkumar@example.com"}</w:t>
-      </w:r>
-      <w:r>
-        <w:br/>
-      </w:r>
-      <w:r>
-        <w:rPr>
-          <w:rFonts w:ascii="Consolas" w:hAnsi="Consolas"/>
-          <w:sz w:val="16"/>
-        </w:rPr>
-        <w:t>Response: {"message":"Student completely updated","student_id":101,</w:t>
-      </w:r>
-      <w:r>
-        <w:br/>
-      </w:r>
-      <w:r>
-        <w:rPr>
-          <w:rFonts w:ascii="Consolas" w:hAnsi="Consolas"/>
-          <w:sz w:val="16"/>
-        </w:rPr>
-        <w:t xml:space="preserve">  "student":{"name":"Rahul Kumar","age":21,"course":"Artificial Intelligence","email":"rahulkumar@example.com"}}</w:t>
+        <w:t>4.7 Real HTTP Method Tests (curl responses)</w:t>
       </w:r>
     </w:p>
     <w:p>
@@ -1298,8 +1669,307 @@
       <w:r>
         <w:rPr>
           <w:rFonts w:ascii="Calibri" w:hAnsi="Calibri"/>
+          <w:sz w:val="22"/>
         </w:rPr>
-        <w:t>PUT replaced the complete student representation.</w:t>
+        <w:t>The exact curl requests and the genuine JSON responses of the running API:</w:t>
+      </w:r>
+    </w:p>
+    <w:p>
+      <w:pPr>
+        <w:spacing w:after="120" w:before="40" w:line="240" w:lineRule="auto"/>
+      </w:pPr>
+      <w:r>
+        <w:rPr>
+          <w:rFonts w:ascii="Consolas" w:hAnsi="Consolas" w:eastAsia="Consolas"/>
+          <w:sz w:val="16"/>
+        </w:rPr>
+        <w:t>### GET /</w:t>
+        <w:br/>
+      </w:r>
+      <w:r>
+        <w:rPr>
+          <w:rFonts w:ascii="Consolas" w:hAnsi="Consolas" w:eastAsia="Consolas"/>
+          <w:sz w:val="16"/>
+        </w:rPr>
+        <w:t>{"message":"Welcome to Student Management API"}</w:t>
+        <w:br/>
+      </w:r>
+      <w:r>
+        <w:rPr>
+          <w:rFonts w:ascii="Consolas" w:hAnsi="Consolas" w:eastAsia="Consolas"/>
+          <w:sz w:val="16"/>
+        </w:rPr>
+        <w:br/>
+      </w:r>
+      <w:r>
+        <w:rPr>
+          <w:rFonts w:ascii="Consolas" w:hAnsi="Consolas" w:eastAsia="Consolas"/>
+          <w:sz w:val="16"/>
+        </w:rPr>
+        <w:t>### POST /students?student_id=101</w:t>
+        <w:br/>
+      </w:r>
+      <w:r>
+        <w:rPr>
+          <w:rFonts w:ascii="Consolas" w:hAnsi="Consolas" w:eastAsia="Consolas"/>
+          <w:sz w:val="16"/>
+        </w:rPr>
+        <w:t xml:space="preserve">   body: {"name":"Rahul","age":20,"course":"Computer Science","email":"rahul@example.com"}</w:t>
+        <w:br/>
+      </w:r>
+      <w:r>
+        <w:rPr>
+          <w:rFonts w:ascii="Consolas" w:hAnsi="Consolas" w:eastAsia="Consolas"/>
+          <w:sz w:val="16"/>
+        </w:rPr>
+        <w:t>{"message":"Student created successfully","student_id":101,</w:t>
+        <w:br/>
+      </w:r>
+      <w:r>
+        <w:rPr>
+          <w:rFonts w:ascii="Consolas" w:hAnsi="Consolas" w:eastAsia="Consolas"/>
+          <w:sz w:val="16"/>
+        </w:rPr>
+        <w:t xml:space="preserve"> "student":{"name":"Rahul","age":20,"course":"Computer Science","email":"rahul@example.com"}}</w:t>
+        <w:br/>
+      </w:r>
+      <w:r>
+        <w:rPr>
+          <w:rFonts w:ascii="Consolas" w:hAnsi="Consolas" w:eastAsia="Consolas"/>
+          <w:sz w:val="16"/>
+        </w:rPr>
+        <w:br/>
+      </w:r>
+      <w:r>
+        <w:rPr>
+          <w:rFonts w:ascii="Consolas" w:hAnsi="Consolas" w:eastAsia="Consolas"/>
+          <w:sz w:val="16"/>
+        </w:rPr>
+        <w:t>### POST /students?student_id=101  (duplicate)</w:t>
+        <w:br/>
+      </w:r>
+      <w:r>
+        <w:rPr>
+          <w:rFonts w:ascii="Consolas" w:hAnsi="Consolas" w:eastAsia="Consolas"/>
+          <w:sz w:val="16"/>
+        </w:rPr>
+        <w:t>HTTP 400   {"detail":"Student ID already exists"}</w:t>
+        <w:br/>
+      </w:r>
+      <w:r>
+        <w:rPr>
+          <w:rFonts w:ascii="Consolas" w:hAnsi="Consolas" w:eastAsia="Consolas"/>
+          <w:sz w:val="16"/>
+        </w:rPr>
+        <w:br/>
+      </w:r>
+      <w:r>
+        <w:rPr>
+          <w:rFonts w:ascii="Consolas" w:hAnsi="Consolas" w:eastAsia="Consolas"/>
+          <w:sz w:val="16"/>
+        </w:rPr>
+        <w:t>### GET /students</w:t>
+        <w:br/>
+      </w:r>
+      <w:r>
+        <w:rPr>
+          <w:rFonts w:ascii="Consolas" w:hAnsi="Consolas" w:eastAsia="Consolas"/>
+          <w:sz w:val="16"/>
+        </w:rPr>
+        <w:t>{"students":{"101":{"name":"Rahul","age":20,"course":"Computer Science","email":"rahul@example.com"}}}</w:t>
+        <w:br/>
+      </w:r>
+      <w:r>
+        <w:rPr>
+          <w:rFonts w:ascii="Consolas" w:hAnsi="Consolas" w:eastAsia="Consolas"/>
+          <w:sz w:val="16"/>
+        </w:rPr>
+        <w:br/>
+      </w:r>
+      <w:r>
+        <w:rPr>
+          <w:rFonts w:ascii="Consolas" w:hAnsi="Consolas" w:eastAsia="Consolas"/>
+          <w:sz w:val="16"/>
+        </w:rPr>
+        <w:t>### GET /students/101</w:t>
+        <w:br/>
+      </w:r>
+      <w:r>
+        <w:rPr>
+          <w:rFonts w:ascii="Consolas" w:hAnsi="Consolas" w:eastAsia="Consolas"/>
+          <w:sz w:val="16"/>
+        </w:rPr>
+        <w:t>{"name":"Rahul","age":20,"course":"Computer Science","email":"rahul@example.com"}</w:t>
+        <w:br/>
+      </w:r>
+      <w:r>
+        <w:rPr>
+          <w:rFonts w:ascii="Consolas" w:hAnsi="Consolas" w:eastAsia="Consolas"/>
+          <w:sz w:val="16"/>
+        </w:rPr>
+        <w:br/>
+      </w:r>
+      <w:r>
+        <w:rPr>
+          <w:rFonts w:ascii="Consolas" w:hAnsi="Consolas" w:eastAsia="Consolas"/>
+          <w:sz w:val="16"/>
+        </w:rPr>
+        <w:t>### PUT /students/101   (replace whole record)</w:t>
+        <w:br/>
+      </w:r>
+      <w:r>
+        <w:rPr>
+          <w:rFonts w:ascii="Consolas" w:hAnsi="Consolas" w:eastAsia="Consolas"/>
+          <w:sz w:val="16"/>
+        </w:rPr>
+        <w:t xml:space="preserve">   body: {"name":"Rahul Kumar","age":21,"course":"Artificial Intelligence","email":"rahulkumar@example.com"}</w:t>
+        <w:br/>
+      </w:r>
+      <w:r>
+        <w:rPr>
+          <w:rFonts w:ascii="Consolas" w:hAnsi="Consolas" w:eastAsia="Consolas"/>
+          <w:sz w:val="16"/>
+        </w:rPr>
+        <w:t>{"message":"Student completely updated","student_id":101,</w:t>
+        <w:br/>
+      </w:r>
+      <w:r>
+        <w:rPr>
+          <w:rFonts w:ascii="Consolas" w:hAnsi="Consolas" w:eastAsia="Consolas"/>
+          <w:sz w:val="16"/>
+        </w:rPr>
+        <w:t xml:space="preserve"> "student":{"name":"Rahul Kumar","age":21,"course":"Artificial Intelligence","email":"rahulkumar@example.com"}}</w:t>
+        <w:br/>
+      </w:r>
+      <w:r>
+        <w:rPr>
+          <w:rFonts w:ascii="Consolas" w:hAnsi="Consolas" w:eastAsia="Consolas"/>
+          <w:sz w:val="16"/>
+        </w:rPr>
+        <w:br/>
+      </w:r>
+      <w:r>
+        <w:rPr>
+          <w:rFonts w:ascii="Consolas" w:hAnsi="Consolas" w:eastAsia="Consolas"/>
+          <w:sz w:val="16"/>
+        </w:rPr>
+        <w:t>### PATCH /students/101   (only course)</w:t>
+        <w:br/>
+      </w:r>
+      <w:r>
+        <w:rPr>
+          <w:rFonts w:ascii="Consolas" w:hAnsi="Consolas" w:eastAsia="Consolas"/>
+          <w:sz w:val="16"/>
+        </w:rPr>
+        <w:t xml:space="preserve">   body: {"course":"Data Science"}</w:t>
+        <w:br/>
+      </w:r>
+      <w:r>
+        <w:rPr>
+          <w:rFonts w:ascii="Consolas" w:hAnsi="Consolas" w:eastAsia="Consolas"/>
+          <w:sz w:val="16"/>
+        </w:rPr>
+        <w:t>{"message":"Student partially updated","student_id":101,</w:t>
+        <w:br/>
+      </w:r>
+      <w:r>
+        <w:rPr>
+          <w:rFonts w:ascii="Consolas" w:hAnsi="Consolas" w:eastAsia="Consolas"/>
+          <w:sz w:val="16"/>
+        </w:rPr>
+        <w:t xml:space="preserve"> "student":{"name":"Rahul Kumar","age":21,"course":"Data Science","email":"rahulkumar@example.com"}}</w:t>
+        <w:br/>
+      </w:r>
+      <w:r>
+        <w:rPr>
+          <w:rFonts w:ascii="Consolas" w:hAnsi="Consolas" w:eastAsia="Consolas"/>
+          <w:sz w:val="16"/>
+        </w:rPr>
+        <w:br/>
+      </w:r>
+      <w:r>
+        <w:rPr>
+          <w:rFonts w:ascii="Consolas" w:hAnsi="Consolas" w:eastAsia="Consolas"/>
+          <w:sz w:val="16"/>
+        </w:rPr>
+        <w:t>### GET /students/999   (missing)</w:t>
+        <w:br/>
+      </w:r>
+      <w:r>
+        <w:rPr>
+          <w:rFonts w:ascii="Consolas" w:hAnsi="Consolas" w:eastAsia="Consolas"/>
+          <w:sz w:val="16"/>
+        </w:rPr>
+        <w:t>HTTP 404   {"detail":"Student not found"}</w:t>
+        <w:br/>
+      </w:r>
+      <w:r>
+        <w:rPr>
+          <w:rFonts w:ascii="Consolas" w:hAnsi="Consolas" w:eastAsia="Consolas"/>
+          <w:sz w:val="16"/>
+        </w:rPr>
+        <w:br/>
+      </w:r>
+      <w:r>
+        <w:rPr>
+          <w:rFonts w:ascii="Consolas" w:hAnsi="Consolas" w:eastAsia="Consolas"/>
+          <w:sz w:val="16"/>
+        </w:rPr>
+        <w:t>### POST invalid age -&gt; HTTP 422    ### POST invalid email -&gt; HTTP 422</w:t>
+        <w:br/>
+      </w:r>
+      <w:r>
+        <w:rPr>
+          <w:rFonts w:ascii="Consolas" w:hAnsi="Consolas" w:eastAsia="Consolas"/>
+          <w:sz w:val="16"/>
+        </w:rPr>
+        <w:br/>
+      </w:r>
+      <w:r>
+        <w:rPr>
+          <w:rFonts w:ascii="Consolas" w:hAnsi="Consolas" w:eastAsia="Consolas"/>
+          <w:sz w:val="16"/>
+        </w:rPr>
+        <w:t>### DELETE /students/101</w:t>
+        <w:br/>
+      </w:r>
+      <w:r>
+        <w:rPr>
+          <w:rFonts w:ascii="Consolas" w:hAnsi="Consolas" w:eastAsia="Consolas"/>
+          <w:sz w:val="16"/>
+        </w:rPr>
+        <w:t>{"message":"Student deleted successfully","student_id":101,</w:t>
+        <w:br/>
+      </w:r>
+      <w:r>
+        <w:rPr>
+          <w:rFonts w:ascii="Consolas" w:hAnsi="Consolas" w:eastAsia="Consolas"/>
+          <w:sz w:val="16"/>
+        </w:rPr>
+        <w:t xml:space="preserve"> "student":{"name":"Rahul Kumar","age":21,"course":"Data Science","email":"rahulkumar@example.com"}}</w:t>
+        <w:br/>
+      </w:r>
+      <w:r>
+        <w:rPr>
+          <w:rFonts w:ascii="Consolas" w:hAnsi="Consolas" w:eastAsia="Consolas"/>
+          <w:sz w:val="16"/>
+        </w:rPr>
+        <w:br/>
+      </w:r>
+      <w:r>
+        <w:rPr>
+          <w:rFonts w:ascii="Consolas" w:hAnsi="Consolas" w:eastAsia="Consolas"/>
+          <w:sz w:val="16"/>
+        </w:rPr>
+        <w:t>### GET /students/101  (after delete)</w:t>
+        <w:br/>
+      </w:r>
+      <w:r>
+        <w:rPr>
+          <w:rFonts w:ascii="Consolas" w:hAnsi="Consolas" w:eastAsia="Consolas"/>
+          <w:sz w:val="16"/>
+        </w:rPr>
+        <w:t>HTTP 404   {"detail":"Student not found"}</w:t>
       </w:r>
     </w:p>
     <w:p>
@@ -1307,39 +1977,456 @@
         <w:pStyle w:val="Heading2"/>
       </w:pPr>
       <w:r>
-        <w:t>8.8 PATCH /students/101 - Partial Update (HTTP 200)</w:t>
+        <w:rPr>
+          <w:rFonts w:ascii="Calibri" w:hAnsi="Calibri"/>
+        </w:rPr>
+        <w:t>4.8 HTTP Methods Overview</w:t>
+      </w:r>
+    </w:p>
+    <w:tbl>
+      <w:tblPr>
+        <w:tblStyle w:val="TableGrid"/>
+        <w:tblW w:type="auto" w:w="0"/>
+        <w:tblLook w:firstColumn="1" w:firstRow="1" w:lastColumn="0" w:lastRow="0" w:noHBand="0" w:noVBand="1" w:val="04A0"/>
+      </w:tblPr>
+      <w:tblGrid>
+        <w:gridCol w:w="2340"/>
+        <w:gridCol w:w="2340"/>
+        <w:gridCol w:w="2340"/>
+        <w:gridCol w:w="2340"/>
+      </w:tblGrid>
+      <w:tr>
+        <w:tc>
+          <w:tcPr>
+            <w:tcW w:type="dxa" w:w="2340"/>
+          </w:tcPr>
+          <w:p>
+            <w:r>
+              <w:rPr>
+                <w:rFonts w:ascii="Calibri" w:hAnsi="Calibri"/>
+                <w:b/>
+                <w:sz w:val="21"/>
+              </w:rPr>
+              <w:t>Method</w:t>
+            </w:r>
+          </w:p>
+        </w:tc>
+        <w:tc>
+          <w:tcPr>
+            <w:tcW w:type="dxa" w:w="2340"/>
+          </w:tcPr>
+          <w:p>
+            <w:r>
+              <w:rPr>
+                <w:rFonts w:ascii="Calibri" w:hAnsi="Calibri"/>
+                <w:b/>
+                <w:sz w:val="21"/>
+              </w:rPr>
+              <w:t>Endpoint</w:t>
+            </w:r>
+          </w:p>
+        </w:tc>
+        <w:tc>
+          <w:tcPr>
+            <w:tcW w:type="dxa" w:w="2340"/>
+          </w:tcPr>
+          <w:p>
+            <w:r>
+              <w:rPr>
+                <w:rFonts w:ascii="Calibri" w:hAnsi="Calibri"/>
+                <w:b/>
+                <w:sz w:val="21"/>
+              </w:rPr>
+              <w:t>Purpose</w:t>
+            </w:r>
+          </w:p>
+        </w:tc>
+        <w:tc>
+          <w:tcPr>
+            <w:tcW w:type="dxa" w:w="2340"/>
+          </w:tcPr>
+          <w:p>
+            <w:r>
+              <w:rPr>
+                <w:rFonts w:ascii="Calibri" w:hAnsi="Calibri"/>
+                <w:b/>
+                <w:sz w:val="21"/>
+              </w:rPr>
+              <w:t>Status on success / failure</w:t>
+            </w:r>
+          </w:p>
+        </w:tc>
+      </w:tr>
+      <w:tr>
+        <w:tc>
+          <w:tcPr>
+            <w:tcW w:type="dxa" w:w="2340"/>
+          </w:tcPr>
+          <w:p>
+            <w:r>
+              <w:rPr>
+                <w:rFonts w:ascii="Calibri" w:hAnsi="Calibri"/>
+                <w:sz w:val="21"/>
+              </w:rPr>
+              <w:t>GET</w:t>
+            </w:r>
+          </w:p>
+        </w:tc>
+        <w:tc>
+          <w:tcPr>
+            <w:tcW w:type="dxa" w:w="2340"/>
+          </w:tcPr>
+          <w:p>
+            <w:r>
+              <w:rPr>
+                <w:rFonts w:ascii="Calibri" w:hAnsi="Calibri"/>
+                <w:sz w:val="21"/>
+              </w:rPr>
+              <w:t>/students</w:t>
+            </w:r>
+          </w:p>
+        </w:tc>
+        <w:tc>
+          <w:tcPr>
+            <w:tcW w:type="dxa" w:w="2340"/>
+          </w:tcPr>
+          <w:p>
+            <w:r>
+              <w:rPr>
+                <w:rFonts w:ascii="Calibri" w:hAnsi="Calibri"/>
+                <w:sz w:val="21"/>
+              </w:rPr>
+              <w:t>List all students</w:t>
+            </w:r>
+          </w:p>
+        </w:tc>
+        <w:tc>
+          <w:tcPr>
+            <w:tcW w:type="dxa" w:w="2340"/>
+          </w:tcPr>
+          <w:p>
+            <w:r>
+              <w:rPr>
+                <w:rFonts w:ascii="Calibri" w:hAnsi="Calibri"/>
+                <w:sz w:val="21"/>
+              </w:rPr>
+              <w:t>200 / -</w:t>
+            </w:r>
+          </w:p>
+        </w:tc>
+      </w:tr>
+      <w:tr>
+        <w:tc>
+          <w:tcPr>
+            <w:tcW w:type="dxa" w:w="2340"/>
+          </w:tcPr>
+          <w:p>
+            <w:r>
+              <w:rPr>
+                <w:rFonts w:ascii="Calibri" w:hAnsi="Calibri"/>
+                <w:sz w:val="21"/>
+              </w:rPr>
+              <w:t>GET</w:t>
+            </w:r>
+          </w:p>
+        </w:tc>
+        <w:tc>
+          <w:tcPr>
+            <w:tcW w:type="dxa" w:w="2340"/>
+          </w:tcPr>
+          <w:p>
+            <w:r>
+              <w:rPr>
+                <w:rFonts w:ascii="Calibri" w:hAnsi="Calibri"/>
+                <w:sz w:val="21"/>
+              </w:rPr>
+              <w:t>/students/{id}</w:t>
+            </w:r>
+          </w:p>
+        </w:tc>
+        <w:tc>
+          <w:tcPr>
+            <w:tcW w:type="dxa" w:w="2340"/>
+          </w:tcPr>
+          <w:p>
+            <w:r>
+              <w:rPr>
+                <w:rFonts w:ascii="Calibri" w:hAnsi="Calibri"/>
+                <w:sz w:val="21"/>
+              </w:rPr>
+              <w:t>Read one student</w:t>
+            </w:r>
+          </w:p>
+        </w:tc>
+        <w:tc>
+          <w:tcPr>
+            <w:tcW w:type="dxa" w:w="2340"/>
+          </w:tcPr>
+          <w:p>
+            <w:r>
+              <w:rPr>
+                <w:rFonts w:ascii="Calibri" w:hAnsi="Calibri"/>
+                <w:sz w:val="21"/>
+              </w:rPr>
+              <w:t>200 / 404</w:t>
+            </w:r>
+          </w:p>
+        </w:tc>
+      </w:tr>
+      <w:tr>
+        <w:tc>
+          <w:tcPr>
+            <w:tcW w:type="dxa" w:w="2340"/>
+          </w:tcPr>
+          <w:p>
+            <w:r>
+              <w:rPr>
+                <w:rFonts w:ascii="Calibri" w:hAnsi="Calibri"/>
+                <w:sz w:val="21"/>
+              </w:rPr>
+              <w:t>POST</w:t>
+            </w:r>
+          </w:p>
+        </w:tc>
+        <w:tc>
+          <w:tcPr>
+            <w:tcW w:type="dxa" w:w="2340"/>
+          </w:tcPr>
+          <w:p>
+            <w:r>
+              <w:rPr>
+                <w:rFonts w:ascii="Calibri" w:hAnsi="Calibri"/>
+                <w:sz w:val="21"/>
+              </w:rPr>
+              <w:t>/students?student_id=&lt;id&gt;</w:t>
+            </w:r>
+          </w:p>
+        </w:tc>
+        <w:tc>
+          <w:tcPr>
+            <w:tcW w:type="dxa" w:w="2340"/>
+          </w:tcPr>
+          <w:p>
+            <w:r>
+              <w:rPr>
+                <w:rFonts w:ascii="Calibri" w:hAnsi="Calibri"/>
+                <w:sz w:val="21"/>
+              </w:rPr>
+              <w:t>Create a student (body JSON)</w:t>
+            </w:r>
+          </w:p>
+        </w:tc>
+        <w:tc>
+          <w:tcPr>
+            <w:tcW w:type="dxa" w:w="2340"/>
+          </w:tcPr>
+          <w:p>
+            <w:r>
+              <w:rPr>
+                <w:rFonts w:ascii="Calibri" w:hAnsi="Calibri"/>
+                <w:sz w:val="21"/>
+              </w:rPr>
+              <w:t>201 / 400 duplicate, 422 invalid</w:t>
+            </w:r>
+          </w:p>
+        </w:tc>
+      </w:tr>
+      <w:tr>
+        <w:tc>
+          <w:tcPr>
+            <w:tcW w:type="dxa" w:w="2340"/>
+          </w:tcPr>
+          <w:p>
+            <w:r>
+              <w:rPr>
+                <w:rFonts w:ascii="Calibri" w:hAnsi="Calibri"/>
+                <w:sz w:val="21"/>
+              </w:rPr>
+              <w:t>PUT</w:t>
+            </w:r>
+          </w:p>
+        </w:tc>
+        <w:tc>
+          <w:tcPr>
+            <w:tcW w:type="dxa" w:w="2340"/>
+          </w:tcPr>
+          <w:p>
+            <w:r>
+              <w:rPr>
+                <w:rFonts w:ascii="Calibri" w:hAnsi="Calibri"/>
+                <w:sz w:val="21"/>
+              </w:rPr>
+              <w:t>/students/{id}</w:t>
+            </w:r>
+          </w:p>
+        </w:tc>
+        <w:tc>
+          <w:tcPr>
+            <w:tcW w:type="dxa" w:w="2340"/>
+          </w:tcPr>
+          <w:p>
+            <w:r>
+              <w:rPr>
+                <w:rFonts w:ascii="Calibri" w:hAnsi="Calibri"/>
+                <w:sz w:val="21"/>
+              </w:rPr>
+              <w:t>Replace the whole student (body JSON)</w:t>
+            </w:r>
+          </w:p>
+        </w:tc>
+        <w:tc>
+          <w:tcPr>
+            <w:tcW w:type="dxa" w:w="2340"/>
+          </w:tcPr>
+          <w:p>
+            <w:r>
+              <w:rPr>
+                <w:rFonts w:ascii="Calibri" w:hAnsi="Calibri"/>
+                <w:sz w:val="21"/>
+              </w:rPr>
+              <w:t>200 / 404</w:t>
+            </w:r>
+          </w:p>
+        </w:tc>
+      </w:tr>
+      <w:tr>
+        <w:tc>
+          <w:tcPr>
+            <w:tcW w:type="dxa" w:w="2340"/>
+          </w:tcPr>
+          <w:p>
+            <w:r>
+              <w:rPr>
+                <w:rFonts w:ascii="Calibri" w:hAnsi="Calibri"/>
+                <w:sz w:val="21"/>
+              </w:rPr>
+              <w:t>PATCH</w:t>
+            </w:r>
+          </w:p>
+        </w:tc>
+        <w:tc>
+          <w:tcPr>
+            <w:tcW w:type="dxa" w:w="2340"/>
+          </w:tcPr>
+          <w:p>
+            <w:r>
+              <w:rPr>
+                <w:rFonts w:ascii="Calibri" w:hAnsi="Calibri"/>
+                <w:sz w:val="21"/>
+              </w:rPr>
+              <w:t>/students/{id}</w:t>
+            </w:r>
+          </w:p>
+        </w:tc>
+        <w:tc>
+          <w:tcPr>
+            <w:tcW w:type="dxa" w:w="2340"/>
+          </w:tcPr>
+          <w:p>
+            <w:r>
+              <w:rPr>
+                <w:rFonts w:ascii="Calibri" w:hAnsi="Calibri"/>
+                <w:sz w:val="21"/>
+              </w:rPr>
+              <w:t>Partially update selected fields</w:t>
+            </w:r>
+          </w:p>
+        </w:tc>
+        <w:tc>
+          <w:tcPr>
+            <w:tcW w:type="dxa" w:w="2340"/>
+          </w:tcPr>
+          <w:p>
+            <w:r>
+              <w:rPr>
+                <w:rFonts w:ascii="Calibri" w:hAnsi="Calibri"/>
+                <w:sz w:val="21"/>
+              </w:rPr>
+              <w:t>200 / 404</w:t>
+            </w:r>
+          </w:p>
+        </w:tc>
+      </w:tr>
+      <w:tr>
+        <w:tc>
+          <w:tcPr>
+            <w:tcW w:type="dxa" w:w="2340"/>
+          </w:tcPr>
+          <w:p>
+            <w:r>
+              <w:rPr>
+                <w:rFonts w:ascii="Calibri" w:hAnsi="Calibri"/>
+                <w:sz w:val="21"/>
+              </w:rPr>
+              <w:t>DELETE</w:t>
+            </w:r>
+          </w:p>
+        </w:tc>
+        <w:tc>
+          <w:tcPr>
+            <w:tcW w:type="dxa" w:w="2340"/>
+          </w:tcPr>
+          <w:p>
+            <w:r>
+              <w:rPr>
+                <w:rFonts w:ascii="Calibri" w:hAnsi="Calibri"/>
+                <w:sz w:val="21"/>
+              </w:rPr>
+              <w:t>/students/{id}</w:t>
+            </w:r>
+          </w:p>
+        </w:tc>
+        <w:tc>
+          <w:tcPr>
+            <w:tcW w:type="dxa" w:w="2340"/>
+          </w:tcPr>
+          <w:p>
+            <w:r>
+              <w:rPr>
+                <w:rFonts w:ascii="Calibri" w:hAnsi="Calibri"/>
+                <w:sz w:val="21"/>
+              </w:rPr>
+              <w:t>Delete a student</w:t>
+            </w:r>
+          </w:p>
+        </w:tc>
+        <w:tc>
+          <w:tcPr>
+            <w:tcW w:type="dxa" w:w="2340"/>
+          </w:tcPr>
+          <w:p>
+            <w:r>
+              <w:rPr>
+                <w:rFonts w:ascii="Calibri" w:hAnsi="Calibri"/>
+                <w:sz w:val="21"/>
+              </w:rPr>
+              <w:t>200 / 404</w:t>
+            </w:r>
+          </w:p>
+        </w:tc>
+      </w:tr>
+    </w:tbl>
+    <w:p>
+      <w:pPr>
+        <w:spacing w:after="120"/>
+      </w:pPr>
+      <w:r>
+        <w:rPr>
+          <w:rFonts w:ascii="Calibri" w:hAnsi="Calibri"/>
+          <w:sz w:val="22"/>
+        </w:rPr>
+        <w:t>Pydantic validated the age range (10-100) and the email format in the two 422 tests; the detail list returned by FastAPI names the exact field and location of each error.</w:t>
       </w:r>
     </w:p>
     <w:p>
       <w:pPr>
-        <w:spacing w:before="40" w:after="120"/>
+        <w:pStyle w:val="Heading1"/>
       </w:pPr>
       <w:r>
         <w:rPr>
-          <w:rFonts w:ascii="Consolas" w:hAnsi="Consolas"/>
-          <w:sz w:val="16"/>
+          <w:rFonts w:ascii="Calibri" w:hAnsi="Calibri"/>
         </w:rPr>
-        <w:t>PATCH /students/101  Body: {"course":"Data Science"}</w:t>
-      </w:r>
-      <w:r>
-        <w:br/>
-      </w:r>
-      <w:r>
-        <w:rPr>
-          <w:rFonts w:ascii="Consolas" w:hAnsi="Consolas"/>
-          <w:sz w:val="16"/>
-        </w:rPr>
-        <w:t>Response: {"message":"Student partially updated","student_id":101,</w:t>
-      </w:r>
-      <w:r>
-        <w:br/>
-      </w:r>
-      <w:r>
-        <w:rPr>
-          <w:rFonts w:ascii="Consolas" w:hAnsi="Consolas"/>
-          <w:sz w:val="16"/>
-        </w:rPr>
-        <w:t xml:space="preserve">  "student":{"name":"Rahul Kumar","age":21,"course":"Data Science","email":"rahulkumar@example.com"}}</w:t>
+        <w:t>5. Result</w:t>
       </w:r>
     </w:p>
     <w:p>
@@ -1349,108 +2436,20 @@
       <w:r>
         <w:rPr>
           <w:rFonts w:ascii="Calibri" w:hAnsi="Calibri"/>
+          <w:sz w:val="22"/>
         </w:rPr>
-        <w:t>PATCH changed only the supplied field; name, age and email were untouched.</w:t>
+        <w:t>The Student Management API was implemented in main.py and executed with uvicorn on port 8001. All five HTTP methods were verified for real: the uvicorn access log shows 201 for creation, 400 for the duplicate, 200 for GET/PUT/PATCH/DELETE, 404 for missing students and 422 for invalid bodies. The Swagger UI at /docs was captured in the browser and works interactively. The API therefore covered the status-code triangular set 200/201, 400, 404 and 422 required to differentiate the success and failure cases of the CRUD operations.</w:t>
       </w:r>
     </w:p>
     <w:p>
       <w:pPr>
-        <w:pStyle w:val="Heading2"/>
-      </w:pPr>
-      <w:r>
-        <w:t>8.9 GET /students/999 - Missing Student (HTTP 404)</w:t>
-      </w:r>
-    </w:p>
-    <w:p>
-      <w:pPr>
-        <w:spacing w:before="40" w:after="120"/>
+        <w:pStyle w:val="Heading1"/>
       </w:pPr>
       <w:r>
         <w:rPr>
-          <w:rFonts w:ascii="Consolas" w:hAnsi="Consolas"/>
-          <w:sz w:val="16"/>
+          <w:rFonts w:ascii="Calibri" w:hAnsi="Calibri"/>
         </w:rPr>
-        <w:t>HTTP 404  {"detail": "Student not found"}</w:t>
-      </w:r>
-    </w:p>
-    <w:p>
-      <w:pPr>
-        <w:pStyle w:val="Heading2"/>
-      </w:pPr>
-      <w:r>
-        <w:t>8.10 Important Error Tests</w:t>
-      </w:r>
-    </w:p>
-    <w:p>
-      <w:pPr>
-        <w:spacing w:before="40" w:after="120"/>
-      </w:pPr>
-      <w:r>
-        <w:rPr>
-          <w:rFonts w:ascii="Consolas" w:hAnsi="Consolas"/>
-          <w:sz w:val="16"/>
-        </w:rPr>
-        <w:t>POST invalid age:  {"age":"twenty"}  -&gt; HTTP 422 (age must be an integer)</w:t>
-      </w:r>
-      <w:r>
-        <w:br/>
-      </w:r>
-      <w:r>
-        <w:rPr>
-          <w:rFonts w:ascii="Consolas" w:hAnsi="Consolas"/>
-          <w:sz w:val="16"/>
-        </w:rPr>
-        <w:t>POST invalid email: {"email":"not-an-email"} -&gt; HTTP 422 (email validation failed)</w:t>
-      </w:r>
-    </w:p>
-    <w:p>
-      <w:pPr>
-        <w:pStyle w:val="Heading2"/>
-      </w:pPr>
-      <w:r>
-        <w:t>8.11 DELETE /students/101 - Delete Student (HTTP 200)</w:t>
-      </w:r>
-    </w:p>
-    <w:p>
-      <w:pPr>
-        <w:spacing w:before="40" w:after="120"/>
-      </w:pPr>
-      <w:r>
-        <w:rPr>
-          <w:rFonts w:ascii="Consolas" w:hAnsi="Consolas"/>
-          <w:sz w:val="16"/>
-        </w:rPr>
-        <w:t>DELETE /students/101</w:t>
-      </w:r>
-      <w:r>
-        <w:br/>
-      </w:r>
-      <w:r>
-        <w:rPr>
-          <w:rFonts w:ascii="Consolas" w:hAnsi="Consolas"/>
-          <w:sz w:val="16"/>
-        </w:rPr>
-        <w:t>Response: {"message":"Student deleted successfully","student_id":101,</w:t>
-      </w:r>
-      <w:r>
-        <w:br/>
-      </w:r>
-      <w:r>
-        <w:rPr>
-          <w:rFonts w:ascii="Consolas" w:hAnsi="Consolas"/>
-          <w:sz w:val="16"/>
-        </w:rPr>
-        <w:t xml:space="preserve">  "student":{"name":"Rahul Kumar","age":21,"course":"Data Science","email":"rahulkumar@example.com"}}</w:t>
-      </w:r>
-      <w:r>
-        <w:br/>
-      </w:r>
-      <w:r>
-        <w:rPr>
-          <w:rFonts w:ascii="Consolas" w:hAnsi="Consolas"/>
-          <w:sz w:val="16"/>
-        </w:rPr>
-        <w:t>GET /students/101  -&gt;  HTTP 404  {"detail": "Student not found"}</w:t>
+        <w:t>6. Conclusion</w:t>
       </w:r>
     </w:p>
     <w:p>
@@ -1460,588 +2459,46 @@
       <w:r>
         <w:rPr>
           <w:rFonts w:ascii="Calibri" w:hAnsi="Calibri"/>
+          <w:sz w:val="22"/>
         </w:rPr>
-        <w:t>After deletion the student is removed from the in-memory dictionary, so GET /students/101 returns 404 with 'Student not found', exactly as documented.</w:t>
-      </w:r>
-    </w:p>
-    <w:p>
-      <w:pPr>
-        <w:pStyle w:val="Heading1"/>
-      </w:pPr>
-      <w:r>
-        <w:t>9. HTTP Methods - Easy Reference</w:t>
-      </w:r>
-    </w:p>
-    <w:tbl>
-      <w:tblPr>
-        <w:tblStyle w:val="TableGrid"/>
-        <w:tblW w:type="auto" w:w="0"/>
-        <w:tblLook w:firstColumn="1" w:firstRow="1" w:lastColumn="0" w:lastRow="0" w:noHBand="0" w:noVBand="1" w:val="04A0"/>
-      </w:tblPr>
-      <w:tblGrid>
-        <w:gridCol w:w="2160"/>
-        <w:gridCol w:w="2160"/>
-        <w:gridCol w:w="2160"/>
-        <w:gridCol w:w="2160"/>
-      </w:tblGrid>
-      <w:tr>
-        <w:tc>
-          <w:tcPr>
-            <w:tcW w:type="dxa" w:w="2160"/>
-          </w:tcPr>
-          <w:p>
-            <w:r>
-              <w:rPr>
-                <w:b/>
-              </w:rPr>
-              <w:t>Method</w:t>
-            </w:r>
-          </w:p>
-        </w:tc>
-        <w:tc>
-          <w:tcPr>
-            <w:tcW w:type="dxa" w:w="2160"/>
-          </w:tcPr>
-          <w:p>
-            <w:r>
-              <w:rPr>
-                <w:b/>
-              </w:rPr>
-              <w:t>Purpose</w:t>
-            </w:r>
-          </w:p>
-        </w:tc>
-        <w:tc>
-          <w:tcPr>
-            <w:tcW w:type="dxa" w:w="2160"/>
-          </w:tcPr>
-          <w:p>
-            <w:r>
-              <w:rPr>
-                <w:b/>
-              </w:rPr>
-              <w:t>Endpoint</w:t>
-            </w:r>
-          </w:p>
-        </w:tc>
-        <w:tc>
-          <w:tcPr>
-            <w:tcW w:type="dxa" w:w="2160"/>
-          </w:tcPr>
-          <w:p>
-            <w:r>
-              <w:rPr>
-                <w:b/>
-              </w:rPr>
-              <w:t>Example</w:t>
-            </w:r>
-          </w:p>
-        </w:tc>
-      </w:tr>
-      <w:tr>
-        <w:tc>
-          <w:tcPr>
-            <w:tcW w:type="dxa" w:w="2160"/>
-          </w:tcPr>
-          <w:p>
-            <w:r>
-              <w:t>GET</w:t>
-            </w:r>
-          </w:p>
-        </w:tc>
-        <w:tc>
-          <w:tcPr>
-            <w:tcW w:type="dxa" w:w="2160"/>
-          </w:tcPr>
-          <w:p>
-            <w:r>
-              <w:t>Read data</w:t>
-            </w:r>
-          </w:p>
-        </w:tc>
-        <w:tc>
-          <w:tcPr>
-            <w:tcW w:type="dxa" w:w="2160"/>
-          </w:tcPr>
-          <w:p>
-            <w:r>
-              <w:t>/students</w:t>
-            </w:r>
-          </w:p>
-        </w:tc>
-        <w:tc>
-          <w:tcPr>
-            <w:tcW w:type="dxa" w:w="2160"/>
-          </w:tcPr>
-          <w:p>
-            <w:r>
-              <w:t>Get all students</w:t>
-            </w:r>
-          </w:p>
-        </w:tc>
-      </w:tr>
-      <w:tr>
-        <w:tc>
-          <w:tcPr>
-            <w:tcW w:type="dxa" w:w="2160"/>
-          </w:tcPr>
-          <w:p>
-            <w:r>
-              <w:t>POST</w:t>
-            </w:r>
-          </w:p>
-        </w:tc>
-        <w:tc>
-          <w:tcPr>
-            <w:tcW w:type="dxa" w:w="2160"/>
-          </w:tcPr>
-          <w:p>
-            <w:r>
-              <w:t>Create data</w:t>
-            </w:r>
-          </w:p>
-        </w:tc>
-        <w:tc>
-          <w:tcPr>
-            <w:tcW w:type="dxa" w:w="2160"/>
-          </w:tcPr>
-          <w:p>
-            <w:r>
-              <w:t>/students</w:t>
-            </w:r>
-          </w:p>
-        </w:tc>
-        <w:tc>
-          <w:tcPr>
-            <w:tcW w:type="dxa" w:w="2160"/>
-          </w:tcPr>
-          <w:p>
-            <w:r>
-              <w:t>Create student</w:t>
-            </w:r>
-          </w:p>
-        </w:tc>
-      </w:tr>
-      <w:tr>
-        <w:tc>
-          <w:tcPr>
-            <w:tcW w:type="dxa" w:w="2160"/>
-          </w:tcPr>
-          <w:p>
-            <w:r>
-              <w:t>PUT</w:t>
-            </w:r>
-          </w:p>
-        </w:tc>
-        <w:tc>
-          <w:tcPr>
-            <w:tcW w:type="dxa" w:w="2160"/>
-          </w:tcPr>
-          <w:p>
-            <w:r>
-              <w:t>Complete update</w:t>
-            </w:r>
-          </w:p>
-        </w:tc>
-        <w:tc>
-          <w:tcPr>
-            <w:tcW w:type="dxa" w:w="2160"/>
-          </w:tcPr>
-          <w:p>
-            <w:r>
-              <w:t>/students/101</w:t>
-            </w:r>
-          </w:p>
-        </w:tc>
-        <w:tc>
-          <w:tcPr>
-            <w:tcW w:type="dxa" w:w="2160"/>
-          </w:tcPr>
-          <w:p>
-            <w:r>
-              <w:t>Replace student</w:t>
-            </w:r>
-          </w:p>
-        </w:tc>
-      </w:tr>
-      <w:tr>
-        <w:tc>
-          <w:tcPr>
-            <w:tcW w:type="dxa" w:w="2160"/>
-          </w:tcPr>
-          <w:p>
-            <w:r>
-              <w:t>PATCH</w:t>
-            </w:r>
-          </w:p>
-        </w:tc>
-        <w:tc>
-          <w:tcPr>
-            <w:tcW w:type="dxa" w:w="2160"/>
-          </w:tcPr>
-          <w:p>
-            <w:r>
-              <w:t>Partial update</w:t>
-            </w:r>
-          </w:p>
-        </w:tc>
-        <w:tc>
-          <w:tcPr>
-            <w:tcW w:type="dxa" w:w="2160"/>
-          </w:tcPr>
-          <w:p>
-            <w:r>
-              <w:t>/students/101</w:t>
-            </w:r>
-          </w:p>
-        </w:tc>
-        <w:tc>
-          <w:tcPr>
-            <w:tcW w:type="dxa" w:w="2160"/>
-          </w:tcPr>
-          <w:p>
-            <w:r>
-              <w:t>Change course</w:t>
-            </w:r>
-          </w:p>
-        </w:tc>
-      </w:tr>
-      <w:tr>
-        <w:tc>
-          <w:tcPr>
-            <w:tcW w:type="dxa" w:w="2160"/>
-          </w:tcPr>
-          <w:p>
-            <w:r>
-              <w:t>DELETE</w:t>
-            </w:r>
-          </w:p>
-        </w:tc>
-        <w:tc>
-          <w:tcPr>
-            <w:tcW w:type="dxa" w:w="2160"/>
-          </w:tcPr>
-          <w:p>
-            <w:r>
-              <w:t>Delete data</w:t>
-            </w:r>
-          </w:p>
-        </w:tc>
-        <w:tc>
-          <w:tcPr>
-            <w:tcW w:type="dxa" w:w="2160"/>
-          </w:tcPr>
-          <w:p>
-            <w:r>
-              <w:t>/students/101</w:t>
-            </w:r>
-          </w:p>
-        </w:tc>
-        <w:tc>
-          <w:tcPr>
-            <w:tcW w:type="dxa" w:w="2160"/>
-          </w:tcPr>
-          <w:p>
-            <w:r>
-              <w:t>Remove student</w:t>
-            </w:r>
-          </w:p>
-        </w:tc>
-      </w:tr>
-    </w:tbl>
-    <w:p/>
-    <w:p>
-      <w:pPr>
-        <w:pStyle w:val="Heading1"/>
-      </w:pPr>
-      <w:r>
-        <w:t>10. Pydantic Model Explanation</w:t>
-      </w:r>
-    </w:p>
-    <w:p>
-      <w:pPr>
-        <w:spacing w:after="120"/>
-      </w:pPr>
-      <w:r>
-        <w:rPr>
-          <w:rFonts w:ascii="Calibri" w:hAnsi="Calibri"/>
-        </w:rPr>
-        <w:t>class Student(BaseModel) defines the expected request data. FastAPI uses this model to validate and parse JSON request bodies: age must be an integer and email must have a valid email format; otherwise HTTP 422 is returned. StudentUpdate, used by PATCH, makes every field optional (str | None = None) so that partial bodies like {"course": "Data Science"} pass validation.</w:t>
-      </w:r>
-    </w:p>
-    <w:p>
-      <w:pPr>
-        <w:pStyle w:val="Heading1"/>
-      </w:pPr>
-      <w:r>
-        <w:t>11. Common Problems and Solutions</w:t>
-      </w:r>
-    </w:p>
-    <w:tbl>
-      <w:tblPr>
-        <w:tblStyle w:val="TableGrid"/>
-        <w:tblW w:type="auto" w:w="0"/>
-        <w:tblLook w:firstColumn="1" w:firstRow="1" w:lastColumn="0" w:lastRow="0" w:noHBand="0" w:noVBand="1" w:val="04A0"/>
-      </w:tblPr>
-      <w:tblGrid>
-        <w:gridCol w:w="4320"/>
-        <w:gridCol w:w="4320"/>
-      </w:tblGrid>
-      <w:tr>
-        <w:tc>
-          <w:tcPr>
-            <w:tcW w:type="dxa" w:w="4320"/>
-          </w:tcPr>
-          <w:p>
-            <w:r>
-              <w:rPr>
-                <w:b/>
-              </w:rPr>
-              <w:t>Problem</w:t>
-            </w:r>
-          </w:p>
-        </w:tc>
-        <w:tc>
-          <w:tcPr>
-            <w:tcW w:type="dxa" w:w="4320"/>
-          </w:tcPr>
-          <w:p>
-            <w:r>
-              <w:rPr>
-                <w:b/>
-              </w:rPr>
-              <w:t>Solution</w:t>
-            </w:r>
-          </w:p>
-        </w:tc>
-      </w:tr>
-      <w:tr>
-        <w:tc>
-          <w:tcPr>
-            <w:tcW w:type="dxa" w:w="4320"/>
-          </w:tcPr>
-          <w:p>
-            <w:r>
-              <w:t>uvicorn is not recognized</w:t>
-            </w:r>
-          </w:p>
-        </w:tc>
-        <w:tc>
-          <w:tcPr>
-            <w:tcW w:type="dxa" w:w="4320"/>
-          </w:tcPr>
-          <w:p>
-            <w:r>
-              <w:t>Activate the virtual environment and run: python -m uvicorn main:app --reload</w:t>
-            </w:r>
-          </w:p>
-        </w:tc>
-      </w:tr>
-      <w:tr>
-        <w:tc>
-          <w:tcPr>
-            <w:tcW w:type="dxa" w:w="4320"/>
-          </w:tcPr>
-          <w:p>
-            <w:r>
-              <w:t>ModuleNotFoundError: fastapi</w:t>
-            </w:r>
-          </w:p>
-        </w:tc>
-        <w:tc>
-          <w:tcPr>
-            <w:tcW w:type="dxa" w:w="4320"/>
-          </w:tcPr>
-          <w:p>
-            <w:r>
-              <w:t>Run: pip install fastapi</w:t>
-            </w:r>
-          </w:p>
-        </w:tc>
-      </w:tr>
-      <w:tr>
-        <w:tc>
-          <w:tcPr>
-            <w:tcW w:type="dxa" w:w="4320"/>
-          </w:tcPr>
-          <w:p>
-            <w:r>
-              <w:t>Email validation error</w:t>
-            </w:r>
-          </w:p>
-        </w:tc>
-        <w:tc>
-          <w:tcPr>
-            <w:tcW w:type="dxa" w:w="4320"/>
-          </w:tcPr>
-          <w:p>
-            <w:r>
-              <w:t>Run: pip install email-validator</w:t>
-            </w:r>
-          </w:p>
-        </w:tc>
-      </w:tr>
-      <w:tr>
-        <w:tc>
-          <w:tcPr>
-            <w:tcW w:type="dxa" w:w="4320"/>
-          </w:tcPr>
-          <w:p>
-            <w:r>
-              <w:t>Port already in use</w:t>
-            </w:r>
-          </w:p>
-        </w:tc>
-        <w:tc>
-          <w:tcPr>
-            <w:tcW w:type="dxa" w:w="4320"/>
-          </w:tcPr>
-          <w:p>
-            <w:r>
-              <w:t>Stop the previous server or run: uvicorn main:app --reload --port 8001 (applied in this session)</w:t>
-            </w:r>
-          </w:p>
-        </w:tc>
-      </w:tr>
-      <w:tr>
-        <w:tc>
-          <w:tcPr>
-            <w:tcW w:type="dxa" w:w="4320"/>
-          </w:tcPr>
-          <w:p>
-            <w:r>
-              <w:t>Swagger page not opening</w:t>
-            </w:r>
-          </w:p>
-        </w:tc>
-        <w:tc>
-          <w:tcPr>
-            <w:tcW w:type="dxa" w:w="4320"/>
-          </w:tcPr>
-          <w:p>
-            <w:r>
-              <w:t>Check the terminal shows Uvicorn running and open http://127.0.0.1:8000/docs</w:t>
-            </w:r>
-          </w:p>
-        </w:tc>
-      </w:tr>
-    </w:tbl>
-    <w:p/>
-    <w:p>
-      <w:pPr>
-        <w:pStyle w:val="Heading1"/>
-      </w:pPr>
-      <w:r>
-        <w:t>12. Project Structure</w:t>
-      </w:r>
-    </w:p>
-    <w:p>
-      <w:pPr>
-        <w:spacing w:before="40" w:after="120"/>
-      </w:pPr>
-      <w:r>
-        <w:rPr>
-          <w:rFonts w:ascii="Consolas" w:hAnsi="Consolas"/>
-          <w:sz w:val="16"/>
-        </w:rPr>
-        <w:t>fastapi_http_methods/</w:t>
-      </w:r>
-      <w:r>
-        <w:br/>
-      </w:r>
-      <w:r>
-        <w:rPr>
-          <w:rFonts w:ascii="Consolas" w:hAnsi="Consolas"/>
-          <w:sz w:val="16"/>
-        </w:rPr>
-        <w:t xml:space="preserve"> |--- venv/</w:t>
-      </w:r>
-      <w:r>
-        <w:br/>
-      </w:r>
-      <w:r>
-        <w:rPr>
-          <w:rFonts w:ascii="Consolas" w:hAnsi="Consolas"/>
-          <w:sz w:val="16"/>
-        </w:rPr>
-        <w:t xml:space="preserve"> |--- main.py</w:t>
-      </w:r>
-      <w:r>
-        <w:br/>
-      </w:r>
-      <w:r>
-        <w:rPr>
-          <w:rFonts w:ascii="Consolas" w:hAnsi="Consolas"/>
-          <w:sz w:val="16"/>
-        </w:rPr>
-        <w:t xml:space="preserve"> `--- requirements.txt</w:t>
-      </w:r>
-    </w:p>
-    <w:p>
-      <w:pPr>
-        <w:pStyle w:val="Heading1"/>
-      </w:pPr>
-      <w:r>
-        <w:t>13. Student Practical Exercise</w:t>
-      </w:r>
-    </w:p>
-    <w:p>
-      <w:pPr>
-        <w:spacing w:after="120"/>
-      </w:pPr>
-      <w:r>
-        <w:rPr>
-          <w:rFonts w:ascii="Calibri" w:hAnsi="Calibri"/>
-        </w:rPr>
-        <w:t>The reference proposes creating an Employee Management API using the same approach with the fields employee_id, name, department, salary and email, implementing POST /employees, GET /employees, GET /employees/{employee_id}, PUT /employees/{employee_id}, PATCH /employees/{employee_id} and DELETE /employees/{employee_id}. This exercise follows the exact same patterns demonstrated above.</w:t>
-      </w:r>
-    </w:p>
-    <w:p>
-      <w:pPr>
-        <w:pStyle w:val="Heading1"/>
-      </w:pPr>
-      <w:r>
-        <w:t>14. Result</w:t>
-      </w:r>
-    </w:p>
-    <w:p>
-      <w:pPr>
-        <w:spacing w:after="120"/>
-      </w:pPr>
-      <w:r>
-        <w:rPr>
-          <w:rFonts w:ascii="Calibri" w:hAnsi="Calibri"/>
-        </w:rPr>
-        <w:t>The complete Student Management API was implemented and every HTTP method was executed and verified for real: GET / returns the welcome message, GET /students lists the students, GET /students/101 reads one student through a path parameter, POST creates a student (HTTP 201 and HTTP 400 for a duplicate id), PUT performs a complete update, PATCH a partial update, and DELETE removes the student. Validation errors and missing records returned HTTP 422 and HTTP 404 respectively. The Swagger UI (HTTP 200 at /docs) provided the interactive documentation.</w:t>
-      </w:r>
-    </w:p>
-    <w:p>
-      <w:pPr>
-        <w:pStyle w:val="Heading1"/>
-      </w:pPr>
-      <w:r>
-        <w:t>15. Conclusion</w:t>
-      </w:r>
-    </w:p>
-    <w:p>
-      <w:pPr>
-        <w:spacing w:after="120"/>
-      </w:pPr>
-      <w:r>
-        <w:rPr>
-          <w:rFonts w:ascii="Calibri" w:hAnsi="Calibri"/>
-        </w:rPr>
-        <w:t>The practical demonstrated the five HTTP methods of a REST API with FastAPI: GET, POST, PUT, PATCH and DELETE, backed by JSON request bodies, Pydantic request validation and the automatic Swagger UI. The real responses above match the documented behaviour, which confirms the FastAPI + Pydantic + Uvicorn toolchain works end to end for building and testing a Student Management API.</w:t>
+        <w:t>The practical showed that FastAPI expresses a complete REST API with very little code: Pydantic models validate the request bodies, decorators such as @app.get, @app.post, @app.put, @app.patch and @app.delete declare the HTTP methods, and the OpenAPI documentation plus Swagger UI are generated automatically. The HTTP method semantics and the CRUD status codes learned here match the Spring Boot (Week 6/7) conventions, confirming that REST and CRUD concepts transfer across the Python and Java stacks covered in the course.</w:t>
       </w:r>
     </w:p>
     <w:sectPr>
+      <w:footerReference w:type="default" r:id="rId12"/>
       <w:pgSz w:w="12240" w:h="15840"/>
-      <w:pgMar w:top="1440" w:right="1800" w:bottom="1440" w:left="1800" w:header="720" w:footer="720" w:gutter="0"/>
+      <w:pgMar w:top="1296" w:right="1440" w:bottom="1296" w:left="1440" w:header="720" w:footer="720" w:gutter="0"/>
       <w:cols w:space="720"/>
       <w:docGrid w:linePitch="360"/>
     </w:sectPr>
   </w:body>
 </w:document>
+</file>
+
+<file path=word/footer1.xml><?xml version="1.0" encoding="utf-8"?>
+<w:ftr xmlns:m="http://schemas.openxmlformats.org/officeDocument/2006/math" xmlns:mc="http://schemas.openxmlformats.org/markup-compatibility/2006" xmlns:mo="http://schemas.microsoft.com/office/mac/office/2008/main" xmlns:mv="urn:schemas-microsoft-com:mac:vml" xmlns:o="urn:schemas-microsoft-com:office:office" xmlns:r="http://schemas.openxmlformats.org/officeDocument/2006/relationships" xmlns:v="urn:schemas-microsoft-com:vml" xmlns:w10="urn:schemas-microsoft-com:office:word" xmlns:w14="http://schemas.microsoft.com/office/word/2010/wordml" xmlns:w="http://schemas.openxmlformats.org/wordprocessingml/2006/main" xmlns:wne="http://schemas.microsoft.com/office/word/2006/wordml" xmlns:wp14="http://schemas.microsoft.com/office/word/2010/wordprocessingDrawing" xmlns:wp="http://schemas.openxmlformats.org/drawingml/2006/wordprocessingDrawing" xmlns:wpc="http://schemas.microsoft.com/office/word/2010/wordprocessingCanvas" xmlns:wpg="http://schemas.microsoft.com/office/word/2010/wordprocessingGroup" xmlns:wpi="http://schemas.microsoft.com/office/word/2010/wordprocessingInk" xmlns:wps="http://schemas.microsoft.com/office/word/2010/wordprocessingShape" mc:Ignorable="w14 wp14">
+  <w:p>
+    <w:pPr>
+      <w:pStyle w:val="Footer"/>
+      <w:jc w:val="center"/>
+    </w:pPr>
+    <w:r>
+      <w:rPr>
+        <w:color w:val="666666"/>
+        <w:sz w:val="18"/>
+      </w:rPr>
+      <w:t xml:space="preserve">KARKALA SHIVA REDDY | 2520030105 | KL UNIVERSITY | Week-8 DB-DS Practical    |    Page </w:t>
+    </w:r>
+    <w:fldSimple w:instr="PAGE">
+      <w:r>
+        <w:rPr>
+          <w:sz w:val="18"/>
+        </w:rPr>
+        <w:t>1</w:t>
+      </w:r>
+    </w:fldSimple>
+  </w:p>
+</w:ftr>
 </file>
 
 <file path=word/numbering.xml><?xml version="1.0" encoding="utf-8"?>
@@ -2407,6 +2864,9 @@
     <w:name w:val="Normal"/>
     <w:qFormat/>
     <w:rsid w:val="00FC693F"/>
+    <w:pPr>
+      <w:spacing w:after="120" w:line="276" w:lineRule="auto"/>
+    </w:pPr>
     <w:rPr>
       <w:rFonts w:ascii="Calibri" w:hAnsi="Calibri"/>
       <w:sz w:val="22"/>
@@ -2471,11 +2931,11 @@
       <w:outlineLvl w:val="0"/>
     </w:pPr>
     <w:rPr>
-      <w:rFonts w:asciiTheme="majorHAnsi" w:eastAsiaTheme="majorEastAsia" w:hAnsiTheme="majorHAnsi" w:cstheme="majorBidi"/>
+      <w:rFonts w:asciiTheme="majorHAnsi" w:eastAsiaTheme="majorEastAsia" w:hAnsiTheme="majorHAnsi" w:cstheme="majorBidi" w:ascii="Calibri" w:hAnsi="Calibri"/>
       <w:b/>
       <w:bCs/>
-      <w:color w:val="365F91" w:themeColor="accent1" w:themeShade="BF"/>
-      <w:sz w:val="28"/>
+      <w:color w:val="1F3B63"/>
+      <w:sz w:val="32"/>
       <w:szCs w:val="28"/>
     </w:rPr>
   </w:style>
@@ -2495,10 +2955,10 @@
       <w:outlineLvl w:val="1"/>
     </w:pPr>
     <w:rPr>
-      <w:rFonts w:asciiTheme="majorHAnsi" w:eastAsiaTheme="majorEastAsia" w:hAnsiTheme="majorHAnsi" w:cstheme="majorBidi"/>
+      <w:rFonts w:asciiTheme="majorHAnsi" w:eastAsiaTheme="majorEastAsia" w:hAnsiTheme="majorHAnsi" w:cstheme="majorBidi" w:ascii="Calibri" w:hAnsi="Calibri"/>
       <w:b/>
       <w:bCs/>
-      <w:color w:val="4F81BD" w:themeColor="accent1"/>
+      <w:color w:val="1F3B63"/>
       <w:sz w:val="26"/>
       <w:szCs w:val="26"/>
     </w:rPr>
@@ -2519,10 +2979,11 @@
       <w:outlineLvl w:val="2"/>
     </w:pPr>
     <w:rPr>
-      <w:rFonts w:asciiTheme="majorHAnsi" w:eastAsiaTheme="majorEastAsia" w:hAnsiTheme="majorHAnsi" w:cstheme="majorBidi"/>
+      <w:rFonts w:asciiTheme="majorHAnsi" w:eastAsiaTheme="majorEastAsia" w:hAnsiTheme="majorHAnsi" w:cstheme="majorBidi" w:ascii="Calibri" w:hAnsi="Calibri"/>
       <w:b/>
       <w:bCs/>
-      <w:color w:val="4F81BD" w:themeColor="accent1"/>
+      <w:color w:val="1F3B63"/>
+      <w:sz w:val="23"/>
     </w:rPr>
   </w:style>
   <w:style w:type="paragraph" w:styleId="Heading4">

</xml_diff>